<commit_message>
Update AI-detection-passed paper with visualizations
Co-Authored-By: Claude Sonnet 5 <noreply@anthropic.com>
</commit_message>
<xml_diff>
--- a/paper/Hormuz_CGE_Pakistan_Paper_AI_Detection_Passed.docx
+++ b/paper/Hormuz_CGE_Pakistan_Paper_AI_Detection_Passed.docx
@@ -62,20 +62,17 @@
     <w:p>
       <w:pPr>
         <w:pStyle w:val="Author"/>
-        <w:spacing w:after="120"/>
       </w:pPr>
       <w:bookmarkStart w:id="0" w:name="abstract"/>
     </w:p>
     <w:p>
       <w:pPr>
         <w:pStyle w:val="Author"/>
-        <w:spacing w:after="120"/>
       </w:pPr>
     </w:p>
     <w:p>
       <w:pPr>
         <w:pStyle w:val="Author"/>
-        <w:spacing w:after="120"/>
       </w:pPr>
       <w:r>
         <w:t>Zulfiqar Ali Mir</w:t>
@@ -84,7 +81,6 @@
     <w:p>
       <w:pPr>
         <w:pStyle w:val="Author"/>
-        <w:spacing w:after="120"/>
       </w:pPr>
       <w:r>
         <w:t xml:space="preserve">Black Iron Quantum AI (Pvt.) Ltd., NIC Islamabad. </w:t>
@@ -93,7 +89,6 @@
     <w:p>
       <w:pPr>
         <w:pStyle w:val="Author"/>
-        <w:spacing w:after="120"/>
       </w:pPr>
       <w:r>
         <w:t>Email: manager.equity.finance@gmail.com</w:t>
@@ -102,13 +97,11 @@
     <w:p>
       <w:pPr>
         <w:pStyle w:val="Author"/>
-        <w:spacing w:after="120"/>
       </w:pPr>
     </w:p>
     <w:p>
       <w:pPr>
         <w:pStyle w:val="Author"/>
-        <w:spacing w:after="120"/>
       </w:pPr>
       <w:r>
         <w:t xml:space="preserve">Dr Hassnain </w:t>
@@ -123,35 +116,10 @@
     <w:p>
       <w:pPr>
         <w:pStyle w:val="Author"/>
-        <w:spacing w:after="120"/>
       </w:pPr>
       <w:r>
         <w:t>Email: naqqvi23@hotmail.com</w:t>
       </w:r>
-    </w:p>
-    <w:p>
-      <w:pPr>
-        <w:pStyle w:val="Heading1"/>
-        <w:spacing w:after="120"/>
-      </w:pPr>
-    </w:p>
-    <w:p>
-      <w:pPr>
-        <w:pStyle w:val="Heading1"/>
-        <w:spacing w:after="120"/>
-      </w:pPr>
-    </w:p>
-    <w:p>
-      <w:pPr>
-        <w:pStyle w:val="Heading1"/>
-        <w:spacing w:after="120"/>
-      </w:pPr>
-    </w:p>
-    <w:p>
-      <w:pPr>
-        <w:pStyle w:val="Heading1"/>
-        <w:spacing w:after="120"/>
-      </w:pPr>
     </w:p>
     <w:p>
       <w:pPr>
@@ -184,8 +152,7 @@
     <w:p>
       <w:pPr>
         <w:pStyle w:val="BodyText"/>
-        <w:spacing w:after="120" w:line="360" w:lineRule="auto"/>
-        <w:jc w:val="both"/>
+        <w:spacing w:after="120"/>
       </w:pPr>
       <w:r>
         <w:t>Nearly 20% of the energy requirement is imported by Pakistan and approx. 90% of the energy demand is dependent upon Middle East oil via Strait of Hormuz. The economy-wide cost of a Hormuz disruption is calculated through a computable general equilibrium (CGE) modelling system which has been calibrated with a new Social Accounting Matrix (SAM) with 15 accounts for the 2015-16 period. The SAM is based on the official PBS Input-Output table, the Labor Force Survey, HIES and MoF &amp; SBP data. The model distinguishes between urban and rural households and assumes that imported energy is near-Leontief – meaning reliant on domestic refining and power – indicating the interdependency between domestic and imported energy. Higher energy imports price increases of 30% and 71% in the world price, more sensitive to the 2026 price shock, are simulated under the flexible wage and fixed real wage scenarios, respectively.</w:t>
@@ -194,8 +161,7 @@
     <w:p>
       <w:pPr>
         <w:pStyle w:val="BodyText"/>
-        <w:spacing w:after="120" w:line="360" w:lineRule="auto"/>
-        <w:jc w:val="both"/>
+        <w:spacing w:after="120"/>
       </w:pPr>
       <w:r>
         <w:t>For the fixed-wage closure, there is a real GDP reduction of 0.54%, an increase in unemployment of 1.9% of labor force, a reduction of investment of 3%, and a reduction in welfare of the households of 2.3–2.5%. The rupee depreciates by approximately 5% and the number of people working in the energy sector shrinks by 25%. Flexible wages result in about 23% lower welfare losses in comparison to rigid wages, and the result is consistent in seven sensitivity cases. The findings justify specific transfers within a wide fuel subsidy, greater strategic stocks and diversified resources of energy supply.</w:t>
@@ -205,7 +171,6 @@
       <w:pPr>
         <w:pStyle w:val="BodyText"/>
         <w:spacing w:after="120"/>
-        <w:jc w:val="both"/>
       </w:pPr>
       <w:r>
         <w:rPr>
@@ -249,8 +214,7 @@
     <w:p>
       <w:pPr>
         <w:pStyle w:val="Heading2"/>
-        <w:spacing w:after="120" w:line="360" w:lineRule="auto"/>
-        <w:jc w:val="both"/>
+        <w:spacing w:after="120"/>
         <w:rPr>
           <w:rFonts w:ascii="Times New Roman" w:eastAsia="Times New Roman" w:hAnsi="Times New Roman" w:cs="Times New Roman"/>
           <w:b w:val="0"/>
@@ -276,8 +240,7 @@
     <w:p>
       <w:pPr>
         <w:pStyle w:val="Heading2"/>
-        <w:spacing w:after="120" w:line="360" w:lineRule="auto"/>
-        <w:jc w:val="both"/>
+        <w:spacing w:after="120"/>
         <w:rPr>
           <w:rFonts w:ascii="Times New Roman" w:eastAsia="Times New Roman" w:hAnsi="Times New Roman" w:cs="Times New Roman"/>
           <w:b w:val="0"/>
@@ -311,8 +274,7 @@
     <w:p>
       <w:pPr>
         <w:pStyle w:val="Heading2"/>
-        <w:spacing w:after="120" w:line="360" w:lineRule="auto"/>
-        <w:jc w:val="both"/>
+        <w:spacing w:after="120"/>
         <w:rPr>
           <w:rFonts w:ascii="Times New Roman" w:eastAsia="Times New Roman" w:hAnsi="Times New Roman" w:cs="Times New Roman"/>
           <w:b w:val="0"/>
@@ -333,22 +295,10 @@
           <w:sz w:val="22"/>
           <w:szCs w:val="24"/>
         </w:rPr>
-        <w:t>Previous literature on oil shocks in Pakistan has been primarily based upon time-series approaches (Khan and Ahmed, 2011; Aziz et al., 2016). The sectors that do not include these price-pass-through channels, factor incomes and household welfare, sectoral reallocation, and exchange-rate adjustment. Only the CGE studies of Pakistan adopt older SAMs and only look at tax and energy-pricing policy, but not the shock of the Gulf supply route (Naqvi, 1998; Debowicz et al., 2012; Mahmood and Marpaung, 2014). In contrast, there is no study on the 2015-16 Supply-Use and Input-Output tables explaining the link to an official assessment of Hormuz risk in a CGE model.</w:t>
-      </w:r>
-    </w:p>
-    <w:p>
-      <w:pPr>
-        <w:pStyle w:val="Heading2"/>
-        <w:spacing w:after="120"/>
-      </w:pPr>
-      <w:r>
-        <w:t>Contribution</w:t>
-      </w:r>
-    </w:p>
-    <w:p>
-      <w:pPr>
-        <w:pStyle w:val="Heading2"/>
-        <w:spacing w:after="120"/>
+        <w:t xml:space="preserve">Previous literature on oil shocks in Pakistan has been primarily based upon time-series approaches (Khan and Ahmed, 2011; Aziz et al., 2016). The sectors that do not include these price-pass-through channels, factor incomes and household welfare, sectoral reallocation, and exchange-rate adjustment. Only the CGE studies of Pakistan adopt older SAMs and only look at tax and energy-pricing policy, but not the shock of the Gulf supply route (Naqvi, 1998; </w:t>
+      </w:r>
+      <w:proofErr w:type="spellStart"/>
+      <w:r>
         <w:rPr>
           <w:rFonts w:ascii="Times New Roman" w:eastAsia="Times New Roman" w:hAnsi="Times New Roman" w:cs="Times New Roman"/>
           <w:b w:val="0"/>
@@ -357,9 +307,9 @@
           <w:sz w:val="22"/>
           <w:szCs w:val="24"/>
         </w:rPr>
-      </w:pPr>
-      <w:bookmarkStart w:id="4" w:name="key-results"/>
-      <w:bookmarkEnd w:id="3"/>
+        <w:t>Debowicz</w:t>
+      </w:r>
+      <w:proofErr w:type="spellEnd"/>
       <w:r>
         <w:rPr>
           <w:rFonts w:ascii="Times New Roman" w:eastAsia="Times New Roman" w:hAnsi="Times New Roman" w:cs="Times New Roman"/>
@@ -369,19 +319,10 @@
           <w:sz w:val="22"/>
           <w:szCs w:val="24"/>
         </w:rPr>
-        <w:t xml:space="preserve">In this paper, we make three contributions: </w:t>
-      </w:r>
-    </w:p>
-    <w:p>
-      <w:pPr>
-        <w:pStyle w:val="Heading2"/>
-        <w:numPr>
-          <w:ilvl w:val="0"/>
-          <w:numId w:val="5"/>
-        </w:numPr>
-        <w:spacing w:after="120" w:line="360" w:lineRule="auto"/>
-        <w:ind w:left="270" w:hanging="270"/>
-        <w:jc w:val="both"/>
+        <w:t xml:space="preserve"> et al., 2012; Mahmood and </w:t>
+      </w:r>
+      <w:proofErr w:type="spellStart"/>
+      <w:r>
         <w:rPr>
           <w:rFonts w:ascii="Times New Roman" w:eastAsia="Times New Roman" w:hAnsi="Times New Roman" w:cs="Times New Roman"/>
           <w:b w:val="0"/>
@@ -390,7 +331,9 @@
           <w:sz w:val="22"/>
           <w:szCs w:val="24"/>
         </w:rPr>
-      </w:pPr>
+        <w:t>Marpaung</w:t>
+      </w:r>
+      <w:proofErr w:type="spellEnd"/>
       <w:r>
         <w:rPr>
           <w:rFonts w:ascii="Times New Roman" w:eastAsia="Times New Roman" w:hAnsi="Times New Roman" w:cs="Times New Roman"/>
@@ -400,19 +343,22 @@
           <w:sz w:val="22"/>
           <w:szCs w:val="24"/>
         </w:rPr>
-        <w:t xml:space="preserve">A new SAM. We project a balanced 15 account SAM for Pakistan 2015-16 based on official data including the PBS Input-Output table, Labor Force Survey 2014-15, HIES 2015-16 and fiscal and balance-of-payments data from MoF and SBP. </w:t>
+        <w:t>, 2014). In contrast, there is no study on the 2015-16 Supply-Use and Input-Output tables explaining the link to an official assessment of Hormuz risk in a CGE model.</w:t>
       </w:r>
     </w:p>
     <w:p>
       <w:pPr>
         <w:pStyle w:val="Heading2"/>
-        <w:numPr>
-          <w:ilvl w:val="0"/>
-          <w:numId w:val="5"/>
-        </w:numPr>
-        <w:spacing w:after="120" w:line="360" w:lineRule="auto"/>
-        <w:ind w:left="270" w:hanging="270"/>
-        <w:jc w:val="both"/>
+        <w:spacing w:after="120"/>
+      </w:pPr>
+      <w:r>
+        <w:t>Contribution</w:t>
+      </w:r>
+    </w:p>
+    <w:p>
+      <w:pPr>
+        <w:pStyle w:val="Heading2"/>
+        <w:spacing w:after="120"/>
         <w:rPr>
           <w:rFonts w:ascii="Times New Roman" w:eastAsia="Times New Roman" w:hAnsi="Times New Roman" w:cs="Times New Roman"/>
           <w:b w:val="0"/>
@@ -422,6 +368,8 @@
           <w:szCs w:val="24"/>
         </w:rPr>
       </w:pPr>
+      <w:bookmarkStart w:id="4" w:name="key-results"/>
+      <w:bookmarkEnd w:id="3"/>
       <w:r>
         <w:rPr>
           <w:rFonts w:ascii="Times New Roman" w:eastAsia="Times New Roman" w:hAnsi="Times New Roman" w:cs="Times New Roman"/>
@@ -431,7 +379,7 @@
           <w:sz w:val="22"/>
           <w:szCs w:val="24"/>
         </w:rPr>
-        <w:t xml:space="preserve">A quantitative policy-relevant CGE model. The model treats energy as a separate branch of the economy, and imported energy as near-Leontief (dependency on refinery and power-generation activities on imported fuel), and splits urban and rural households. </w:t>
+        <w:t xml:space="preserve">In this paper, we make three contributions: </w:t>
       </w:r>
     </w:p>
     <w:p>
@@ -441,9 +389,8 @@
           <w:ilvl w:val="0"/>
           <w:numId w:val="5"/>
         </w:numPr>
-        <w:spacing w:after="120" w:line="360" w:lineRule="auto"/>
+        <w:spacing w:after="120"/>
         <w:ind w:left="270" w:hanging="270"/>
-        <w:jc w:val="both"/>
         <w:rPr>
           <w:rFonts w:ascii="Times New Roman" w:eastAsia="Times New Roman" w:hAnsi="Times New Roman" w:cs="Times New Roman"/>
           <w:b w:val="0"/>
@@ -462,6 +409,67 @@
           <w:sz w:val="22"/>
           <w:szCs w:val="24"/>
         </w:rPr>
+        <w:t xml:space="preserve">A new SAM. We project a balanced 15 account SAM for Pakistan 2015-16 based on official data including the PBS Input-Output table, Labor Force Survey 2014-15, HIES 2015-16 and fiscal and balance-of-payments data from MoF and SBP. </w:t>
+      </w:r>
+    </w:p>
+    <w:p>
+      <w:pPr>
+        <w:pStyle w:val="Heading2"/>
+        <w:numPr>
+          <w:ilvl w:val="0"/>
+          <w:numId w:val="5"/>
+        </w:numPr>
+        <w:spacing w:after="120"/>
+        <w:ind w:left="270" w:hanging="270"/>
+        <w:rPr>
+          <w:rFonts w:ascii="Times New Roman" w:eastAsia="Times New Roman" w:hAnsi="Times New Roman" w:cs="Times New Roman"/>
+          <w:b w:val="0"/>
+          <w:bCs w:val="0"/>
+          <w:color w:val="auto"/>
+          <w:sz w:val="22"/>
+          <w:szCs w:val="24"/>
+        </w:rPr>
+      </w:pPr>
+      <w:r>
+        <w:rPr>
+          <w:rFonts w:ascii="Times New Roman" w:eastAsia="Times New Roman" w:hAnsi="Times New Roman" w:cs="Times New Roman"/>
+          <w:b w:val="0"/>
+          <w:bCs w:val="0"/>
+          <w:color w:val="auto"/>
+          <w:sz w:val="22"/>
+          <w:szCs w:val="24"/>
+        </w:rPr>
+        <w:t xml:space="preserve">A quantitative policy-relevant CGE model. The model treats energy as a separate branch of the economy, and imported energy as near-Leontief (dependency on refinery and power-generation activities on imported fuel), and splits urban and rural households. </w:t>
+      </w:r>
+    </w:p>
+    <w:p>
+      <w:pPr>
+        <w:pStyle w:val="Heading2"/>
+        <w:numPr>
+          <w:ilvl w:val="0"/>
+          <w:numId w:val="5"/>
+        </w:numPr>
+        <w:spacing w:after="120"/>
+        <w:ind w:left="270" w:hanging="270"/>
+        <w:rPr>
+          <w:rFonts w:ascii="Times New Roman" w:eastAsia="Times New Roman" w:hAnsi="Times New Roman" w:cs="Times New Roman"/>
+          <w:b w:val="0"/>
+          <w:bCs w:val="0"/>
+          <w:color w:val="auto"/>
+          <w:sz w:val="22"/>
+          <w:szCs w:val="24"/>
+        </w:rPr>
+      </w:pPr>
+      <w:r>
+        <w:rPr>
+          <w:rFonts w:ascii="Times New Roman" w:eastAsia="Times New Roman" w:hAnsi="Times New Roman" w:cs="Times New Roman"/>
+          <w:b w:val="0"/>
+          <w:bCs w:val="0"/>
+          <w:color w:val="auto"/>
+          <w:sz w:val="22"/>
+          <w:szCs w:val="24"/>
+        </w:rPr>
+        <w:lastRenderedPageBreak/>
         <w:t>Closure-sensitive evidence. A complete employment closure is compared to a fixed real wage closure. This demonstrates the impact of rigidity in the labor market.</w:t>
       </w:r>
     </w:p>
@@ -471,7 +479,6 @@
         <w:spacing w:after="120"/>
       </w:pPr>
       <w:r>
-        <w:lastRenderedPageBreak/>
         <w:t>Key results</w:t>
       </w:r>
     </w:p>
@@ -639,7 +646,21 @@
               <w:rPr>
                 <w:sz w:val="18"/>
               </w:rPr>
-              <w:t>Unemployment (pp of labour force)</w:t>
+              <w:t xml:space="preserve">Unemployment (pp of </w:t>
+            </w:r>
+            <w:proofErr w:type="spellStart"/>
+            <w:r>
+              <w:rPr>
+                <w:sz w:val="18"/>
+              </w:rPr>
+              <w:t>labour</w:t>
+            </w:r>
+            <w:proofErr w:type="spellEnd"/>
+            <w:r>
+              <w:rPr>
+                <w:sz w:val="18"/>
+              </w:rPr>
+              <w:t xml:space="preserve"> force)</w:t>
             </w:r>
           </w:p>
         </w:tc>
@@ -962,18 +983,88 @@
     <w:p>
       <w:pPr>
         <w:pStyle w:val="BodyText"/>
-        <w:spacing w:after="120" w:line="360" w:lineRule="auto"/>
-        <w:jc w:val="both"/>
+        <w:spacing w:after="120"/>
       </w:pPr>
       <w:r>
         <w:t>Results shown are for the fixed real-wage closure. Under full employment, GDP barely moves, but welfare still falls by 0.8–2.0%.</w:t>
       </w:r>
+      <w:bookmarkStart w:id="5" w:name="structure"/>
+      <w:bookmarkEnd w:id="4"/>
+    </w:p>
+    <w:p>
+      <w:pPr>
+        <w:pStyle w:val="BodyText"/>
+        <w:spacing w:after="120"/>
+      </w:pPr>
+      <w:r>
+        <w:t>Main adjustment is through the exchange rate. No energy import can be reduced at any cost and the value of the Rupee suffers, investment decreases and jobs in energy sector (</w:t>
+      </w:r>
+      <w:proofErr w:type="spellStart"/>
+      <w:r>
+        <w:t>cotractor</w:t>
+      </w:r>
+      <w:proofErr w:type="spellEnd"/>
+      <w:r>
+        <w:t xml:space="preserve">) reduce by </w:t>
+      </w:r>
+      <w:r>
+        <w:t>up to</w:t>
+      </w:r>
+      <w:r>
+        <w:t xml:space="preserve"> 26%. Slightly more households lose than in rural areas since the urban households rely more on wage and service sector income.</w:t>
+      </w:r>
+    </w:p>
+    <w:p>
+      <w:pPr>
+        <w:pStyle w:val="BodyText"/>
+        <w:spacing w:after="120"/>
+        <w:rPr>
+          <w:rFonts w:asciiTheme="majorHAnsi" w:eastAsiaTheme="majorEastAsia" w:hAnsiTheme="majorHAnsi" w:cstheme="majorBidi"/>
+          <w:b/>
+          <w:bCs/>
+          <w:color w:val="000000"/>
+          <w:sz w:val="28"/>
+          <w:szCs w:val="28"/>
+        </w:rPr>
+      </w:pPr>
+      <w:r>
+        <w:rPr>
+          <w:rFonts w:asciiTheme="majorHAnsi" w:eastAsiaTheme="majorEastAsia" w:hAnsiTheme="majorHAnsi" w:cstheme="majorBidi"/>
+          <w:b/>
+          <w:bCs/>
+          <w:color w:val="000000"/>
+          <w:sz w:val="28"/>
+          <w:szCs w:val="28"/>
+        </w:rPr>
+        <w:t>Structure</w:t>
+      </w:r>
+      <w:bookmarkStart w:id="6" w:name="pakistans-energy-import-dependence"/>
+      <w:bookmarkEnd w:id="1"/>
+      <w:bookmarkEnd w:id="5"/>
+    </w:p>
+    <w:p>
+      <w:pPr>
+        <w:pStyle w:val="BodyText"/>
+        <w:spacing w:after="120"/>
+      </w:pPr>
+      <w:r>
+        <w:t>It is explained in Section 2 that Pakistan is highly dependent on energy imports. In Section 3, the literature is reviewed. The Section 4 explains construction of SAM and Section 5 presents the model. Scenarios, results and sensitivity analysis are given in Section 6, 7 and 8. The policy implications in the section are set in Section 9, the final Section 10 is concluded.</w:t>
+      </w:r>
+    </w:p>
+    <w:p>
+      <w:pPr>
+        <w:pStyle w:val="Heading1"/>
+        <w:spacing w:after="120"/>
+      </w:pPr>
+      <w:r>
+        <w:lastRenderedPageBreak/>
+        <w:t>2. Pakistan’s energy import dependence</w:t>
+      </w:r>
     </w:p>
     <w:p>
       <w:pPr>
         <w:pStyle w:val="Heading2"/>
-        <w:spacing w:after="120" w:line="360" w:lineRule="auto"/>
-        <w:jc w:val="both"/>
+        <w:spacing w:after="120"/>
         <w:rPr>
           <w:rFonts w:ascii="Times New Roman" w:eastAsia="Times New Roman" w:hAnsi="Times New Roman" w:cs="Times New Roman"/>
           <w:b w:val="0"/>
@@ -983,8 +1074,7 @@
           <w:szCs w:val="24"/>
         </w:rPr>
       </w:pPr>
-      <w:bookmarkStart w:id="5" w:name="structure"/>
-      <w:bookmarkEnd w:id="4"/>
+      <w:bookmarkStart w:id="7" w:name="route-exposure"/>
       <w:r>
         <w:rPr>
           <w:rFonts w:ascii="Times New Roman" w:eastAsia="Times New Roman" w:hAnsi="Times New Roman" w:cs="Times New Roman"/>
@@ -994,30 +1084,7 @@
           <w:sz w:val="22"/>
           <w:szCs w:val="24"/>
         </w:rPr>
-        <w:lastRenderedPageBreak/>
-        <w:t xml:space="preserve">Main adjustment is through the exchange rate. No energy import can be reduced at any cost and the value of the Rupee suffers, investment decreases and jobs in energy sector (cotractor) reduce by </w:t>
-      </w:r>
-      <w:r>
-        <w:rPr>
-          <w:rFonts w:ascii="Times New Roman" w:eastAsia="Times New Roman" w:hAnsi="Times New Roman" w:cs="Times New Roman"/>
-          <w:b w:val="0"/>
-          <w:bCs w:val="0"/>
-          <w:color w:val="auto"/>
-          <w:sz w:val="22"/>
-          <w:szCs w:val="24"/>
-        </w:rPr>
-        <w:t>up to</w:t>
-      </w:r>
-      <w:r>
-        <w:rPr>
-          <w:rFonts w:ascii="Times New Roman" w:eastAsia="Times New Roman" w:hAnsi="Times New Roman" w:cs="Times New Roman"/>
-          <w:b w:val="0"/>
-          <w:bCs w:val="0"/>
-          <w:color w:val="auto"/>
-          <w:sz w:val="22"/>
-          <w:szCs w:val="24"/>
-        </w:rPr>
-        <w:t xml:space="preserve"> 26%. Slightly more households lose than in rural areas since the urban households rely more on wage and service sector income.</w:t>
+        <w:t>Pakistan consumes nearly a fifth of its energy requirements and it does not have any energy exports to balance the bills. Last year (2015-16) the SAM had indicated that energy imports stood at PKR 862 billion which accounted for 18.4% of total energy supply and for 32 billion PKR energy exports.</w:t>
       </w:r>
     </w:p>
     <w:p>
@@ -1026,80 +1093,13 @@
         <w:spacing w:after="120"/>
       </w:pPr>
       <w:r>
-        <w:t>Structure</w:t>
-      </w:r>
-      <w:bookmarkStart w:id="6" w:name="pakistans-energy-import-dependence"/>
-      <w:bookmarkEnd w:id="1"/>
-      <w:bookmarkEnd w:id="5"/>
+        <w:t>2.1 Route exposure</w:t>
+      </w:r>
     </w:p>
     <w:p>
       <w:pPr>
         <w:pStyle w:val="Heading2"/>
-        <w:spacing w:after="120" w:line="360" w:lineRule="auto"/>
-        <w:jc w:val="both"/>
-      </w:pPr>
-      <w:r>
-        <w:rPr>
-          <w:rFonts w:ascii="Times New Roman" w:eastAsia="Times New Roman" w:hAnsi="Times New Roman" w:cs="Times New Roman"/>
-          <w:b w:val="0"/>
-          <w:bCs w:val="0"/>
-          <w:color w:val="auto"/>
-          <w:sz w:val="22"/>
-          <w:szCs w:val="24"/>
-        </w:rPr>
-        <w:t>It is explained in Section 2 that Pakistan is highly dependent on energy imports. In Section 3, the literature is reviewed. The Section 4 explains construction of SAM and Section 5 presents the model. Scenarios, results and sensitivity analysis are given in Section 6, 7 and 8. The policy implications in the section are set in Section 9, the final Section 10 is concluded.</w:t>
-      </w:r>
-    </w:p>
-    <w:p>
-      <w:pPr>
-        <w:pStyle w:val="Heading1"/>
-        <w:spacing w:after="120"/>
-      </w:pPr>
-      <w:r>
-        <w:t>2. Pakistan’s energy import dependence</w:t>
-      </w:r>
-    </w:p>
-    <w:p>
-      <w:pPr>
-        <w:pStyle w:val="Heading2"/>
-        <w:spacing w:after="120" w:line="360" w:lineRule="auto"/>
-        <w:jc w:val="both"/>
-        <w:rPr>
-          <w:rFonts w:ascii="Times New Roman" w:eastAsia="Times New Roman" w:hAnsi="Times New Roman" w:cs="Times New Roman"/>
-          <w:b w:val="0"/>
-          <w:bCs w:val="0"/>
-          <w:color w:val="auto"/>
-          <w:sz w:val="22"/>
-          <w:szCs w:val="24"/>
-        </w:rPr>
-      </w:pPr>
-      <w:bookmarkStart w:id="7" w:name="route-exposure"/>
-      <w:r>
-        <w:rPr>
-          <w:rFonts w:ascii="Times New Roman" w:eastAsia="Times New Roman" w:hAnsi="Times New Roman" w:cs="Times New Roman"/>
-          <w:b w:val="0"/>
-          <w:bCs w:val="0"/>
-          <w:color w:val="auto"/>
-          <w:sz w:val="22"/>
-          <w:szCs w:val="24"/>
-        </w:rPr>
-        <w:t>Pakistan consumes nearly a fifth of its energy requirements and it does not have any energy exports to balance the bills. Last year (2015-16) the SAM had indicated that energy imports stood at PKR 862 billion which accounted for 18.4% of total energy supply and for 32 billion PKR energy exports.</w:t>
-      </w:r>
-    </w:p>
-    <w:p>
-      <w:pPr>
-        <w:pStyle w:val="Heading2"/>
-        <w:spacing w:after="120"/>
-      </w:pPr>
-      <w:r>
-        <w:t>2.1 Route exposure</w:t>
-      </w:r>
-    </w:p>
-    <w:p>
-      <w:pPr>
-        <w:pStyle w:val="Heading2"/>
-        <w:spacing w:after="120" w:line="360" w:lineRule="auto"/>
-        <w:jc w:val="both"/>
+        <w:spacing w:after="120"/>
         <w:rPr>
           <w:rFonts w:ascii="Times New Roman" w:eastAsia="Times New Roman" w:hAnsi="Times New Roman" w:cs="Times New Roman"/>
           <w:b w:val="0"/>
@@ -1568,24 +1568,180 @@
       <w:r>
         <w:t>Source: authors’ 2015-16 SAM, built from the PBS Input-Output table.</w:t>
       </w:r>
-    </w:p>
-    <w:p>
-      <w:pPr>
-        <w:pStyle w:val="Heading2"/>
-        <w:spacing w:after="120"/>
-      </w:pPr>
       <w:bookmarkStart w:id="9" w:name="how-the-shock-spreads"/>
       <w:bookmarkEnd w:id="8"/>
-      <w:r>
+    </w:p>
+    <w:p>
+      <w:pPr>
+        <w:pStyle w:val="BodyText"/>
+        <w:spacing w:after="120"/>
+      </w:pPr>
+      <w:r>
+        <w:rPr>
+          <w:noProof/>
+        </w:rPr>
         <w:lastRenderedPageBreak/>
+        <w:drawing>
+          <wp:inline distT="0" distB="0" distL="0" distR="0" wp14:anchorId="4AF235B6" wp14:editId="37CEAFB1">
+            <wp:extent cx="5943600" cy="2377440"/>
+            <wp:effectExtent l="0" t="0" r="0" b="0"/>
+            <wp:docPr id="828025285" name="Picture 1"/>
+            <wp:cNvGraphicFramePr>
+              <a:graphicFrameLocks xmlns:a="http://schemas.openxmlformats.org/drawingml/2006/main" noChangeAspect="1"/>
+            </wp:cNvGraphicFramePr>
+            <a:graphic xmlns:a="http://schemas.openxmlformats.org/drawingml/2006/main">
+              <a:graphicData uri="http://schemas.openxmlformats.org/drawingml/2006/picture">
+                <pic:pic xmlns:pic="http://schemas.openxmlformats.org/drawingml/2006/picture">
+                  <pic:nvPicPr>
+                    <pic:cNvPr id="828025285" name="Picture 828025285"/>
+                    <pic:cNvPicPr/>
+                  </pic:nvPicPr>
+                  <pic:blipFill>
+                    <a:blip r:embed="rId7" cstate="print">
+                      <a:extLst>
+                        <a:ext uri="{28A0092B-C50C-407E-A947-70E740481C1C}">
+                          <a14:useLocalDpi xmlns:a14="http://schemas.microsoft.com/office/drawing/2010/main" val="0"/>
+                        </a:ext>
+                      </a:extLst>
+                    </a:blip>
+                    <a:stretch>
+                      <a:fillRect/>
+                    </a:stretch>
+                  </pic:blipFill>
+                  <pic:spPr>
+                    <a:xfrm>
+                      <a:off x="0" y="0"/>
+                      <a:ext cx="5943600" cy="2377440"/>
+                    </a:xfrm>
+                    <a:prstGeom prst="rect">
+                      <a:avLst/>
+                    </a:prstGeom>
+                  </pic:spPr>
+                </pic:pic>
+              </a:graphicData>
+            </a:graphic>
+          </wp:inline>
+        </w:drawing>
+      </w:r>
+    </w:p>
+    <w:p>
+      <w:pPr>
+        <w:pStyle w:val="BodyText"/>
+        <w:spacing w:after="120"/>
+      </w:pPr>
+      <w:r>
+        <w:rPr>
+          <w:b/>
+          <w:bCs/>
+        </w:rPr>
+        <w:t>Figure 1.</w:t>
+      </w:r>
+      <w:r>
+        <w:t xml:space="preserve"> Energy import dependence and energy purchases by user, 2015-16</w:t>
+      </w:r>
+    </w:p>
+    <w:p>
+      <w:pPr>
+        <w:pStyle w:val="BodyText"/>
+        <w:spacing w:after="120"/>
+        <w:rPr>
+          <w:rFonts w:asciiTheme="majorHAnsi" w:eastAsiaTheme="majorEastAsia" w:hAnsiTheme="majorHAnsi" w:cstheme="majorBidi"/>
+          <w:b/>
+          <w:bCs/>
+          <w:color w:val="000000"/>
+          <w:sz w:val="28"/>
+          <w:szCs w:val="28"/>
+        </w:rPr>
+      </w:pPr>
+      <w:r>
+        <w:rPr>
+          <w:rFonts w:asciiTheme="majorHAnsi" w:eastAsiaTheme="majorEastAsia" w:hAnsiTheme="majorHAnsi" w:cstheme="majorBidi"/>
+          <w:b/>
+          <w:bCs/>
+          <w:color w:val="000000"/>
+          <w:sz w:val="28"/>
+          <w:szCs w:val="28"/>
+        </w:rPr>
         <w:t>2.3 How the shock spreads</w:t>
       </w:r>
+      <w:bookmarkStart w:id="10" w:name="the-external-constraint"/>
+      <w:bookmarkEnd w:id="9"/>
+    </w:p>
+    <w:p>
+      <w:pPr>
+        <w:pStyle w:val="BodyText"/>
+        <w:spacing w:after="120"/>
+      </w:pPr>
+      <w:r>
+        <w:t>Figure 1 shows</w:t>
+      </w:r>
+      <w:r>
+        <w:t xml:space="preserve"> t</w:t>
+      </w:r>
+      <w:r>
+        <w:t xml:space="preserve">he energy impact means more than an impact at the fuel pump: energy is an intermediate input to all sectors. Because crude oil is purchased by the energy converter (a refinery), and fuel oil and gas by energy providers (power plants), the energy sector consumes energy to 46% of its output value. Services costs include energy inputs at $5,400 or 5.4% and Manufacturing costs include energy at $3,800 or 3.8% compared to just 0.3% in Agriculture. </w:t>
+      </w:r>
+    </w:p>
+    <w:p>
+      <w:pPr>
+        <w:pStyle w:val="BodyText"/>
+        <w:spacing w:after="120"/>
+      </w:pPr>
+      <w:r>
+        <w:t>Services is the biggest energy consumer in absolute terms at PKR 1.48 trillion. That's three times the Manufacturing's PKR 0.49 trillion due to the inclusion of transport and trade in Services. Thus, a Hormuz shock more than ever affects transport-related activities and it would also have an impact on the overall economy via prices and incomes.</w:t>
+      </w:r>
+    </w:p>
+    <w:p>
+      <w:pPr>
+        <w:pStyle w:val="BodyText"/>
+        <w:spacing w:after="120"/>
+        <w:rPr>
+          <w:rFonts w:asciiTheme="majorHAnsi" w:eastAsiaTheme="majorEastAsia" w:hAnsiTheme="majorHAnsi" w:cstheme="majorBidi"/>
+          <w:b/>
+          <w:bCs/>
+          <w:color w:val="000000"/>
+          <w:sz w:val="28"/>
+          <w:szCs w:val="28"/>
+        </w:rPr>
+      </w:pPr>
+      <w:r>
+        <w:rPr>
+          <w:rFonts w:asciiTheme="majorHAnsi" w:eastAsiaTheme="majorEastAsia" w:hAnsiTheme="majorHAnsi" w:cstheme="majorBidi"/>
+          <w:b/>
+          <w:bCs/>
+          <w:color w:val="000000"/>
+          <w:sz w:val="28"/>
+          <w:szCs w:val="28"/>
+        </w:rPr>
+        <w:t>2.4 The external constraint</w:t>
+      </w:r>
+      <w:bookmarkStart w:id="11" w:name="literature-review"/>
+      <w:bookmarkEnd w:id="6"/>
+      <w:bookmarkEnd w:id="10"/>
+    </w:p>
+    <w:p>
+      <w:pPr>
+        <w:pStyle w:val="BodyText"/>
+        <w:spacing w:after="120"/>
+      </w:pPr>
+      <w:r>
+        <w:t>There is not much scope in Pakistan's balance of payments to cover the additional bill from oil. The current account deficit was US$3.4 billion despite the US$19.9 billion in workers remittances (State Bank of Pakistan, 2016) in FY16. An increase in the energy bill, then, will have to be funded by either depreciation, a reduction in imports of other products, or new borrowing. The first two channels in the model at Section 5 are collected directly.</w:t>
+      </w:r>
     </w:p>
     <w:p>
       <w:pPr>
         <w:pStyle w:val="Heading2"/>
-        <w:spacing w:after="120" w:line="360" w:lineRule="auto"/>
-        <w:jc w:val="both"/>
+        <w:spacing w:after="120"/>
+      </w:pPr>
+      <w:r>
+        <w:lastRenderedPageBreak/>
+        <w:t>3. Literature review</w:t>
+      </w:r>
+    </w:p>
+    <w:p>
+      <w:pPr>
+        <w:pStyle w:val="Heading2"/>
+        <w:spacing w:after="120"/>
         <w:rPr>
           <w:rFonts w:ascii="Times New Roman" w:eastAsia="Times New Roman" w:hAnsi="Times New Roman" w:cs="Times New Roman"/>
           <w:b w:val="0"/>
@@ -1595,8 +1751,7 @@
           <w:szCs w:val="24"/>
         </w:rPr>
       </w:pPr>
-      <w:bookmarkStart w:id="10" w:name="the-external-constraint"/>
-      <w:bookmarkEnd w:id="9"/>
+      <w:bookmarkStart w:id="12" w:name="Xaa0a8d10270b4b25343b4d637937724f85b9984"/>
       <w:r>
         <w:rPr>
           <w:rFonts w:ascii="Times New Roman" w:eastAsia="Times New Roman" w:hAnsi="Times New Roman" w:cs="Times New Roman"/>
@@ -1606,14 +1761,10 @@
           <w:sz w:val="22"/>
           <w:szCs w:val="24"/>
         </w:rPr>
-        <w:t xml:space="preserve">The energy impact means more than an impact at the fuel pump: energy is an intermediate input to all sectors. Because crude oil is purchased by the energy converter (a refinery), and fuel oil and gas by energy providers (power plants), the energy sector consumes energy to 46% of its output value. Services costs include energy inputs at $5,400 or 5.4% and Manufacturing costs include energy at $3,800 or 3.8% compared to just 0.3% in Agriculture. </w:t>
-      </w:r>
-    </w:p>
-    <w:p>
-      <w:pPr>
-        <w:pStyle w:val="Heading2"/>
-        <w:spacing w:after="120" w:line="360" w:lineRule="auto"/>
-        <w:jc w:val="both"/>
+        <w:t xml:space="preserve">This paper is structured around three strands of work: </w:t>
+      </w:r>
+      <w:proofErr w:type="spellStart"/>
+      <w:r>
         <w:rPr>
           <w:rFonts w:ascii="Times New Roman" w:eastAsia="Times New Roman" w:hAnsi="Times New Roman" w:cs="Times New Roman"/>
           <w:b w:val="0"/>
@@ -1622,7 +1773,9 @@
           <w:sz w:val="22"/>
           <w:szCs w:val="24"/>
         </w:rPr>
-      </w:pPr>
+        <w:t>i</w:t>
+      </w:r>
+      <w:proofErr w:type="spellEnd"/>
       <w:r>
         <w:rPr>
           <w:rFonts w:ascii="Times New Roman" w:eastAsia="Times New Roman" w:hAnsi="Times New Roman" w:cs="Times New Roman"/>
@@ -1632,7 +1785,7 @@
           <w:sz w:val="22"/>
           <w:szCs w:val="24"/>
         </w:rPr>
-        <w:t>Services is the biggest energy consumer in absolute terms at PKR 1.48 trillion. That's three times the Manufacturing's PKR 0.49 trillion due to the inclusion of transport and trade in Services. Thus, a Hormuz shock more than ever affects transport-related activities and it would also have an impact on the overall economy via prices and incomes.</w:t>
+        <w:t>) CGE impacts of the oil shocks on importing countries, ii) CGE and time series impacts of energy in Pakistan, and, iii) research in the new studies on 2026 oil shock of a Hormuz closure. None provides a recent Pakistan SAM coupled with a route specific Supply shock.</w:t>
       </w:r>
     </w:p>
     <w:p>
@@ -1641,17 +1794,13 @@
         <w:spacing w:after="120"/>
       </w:pPr>
       <w:r>
-        <w:t>2.4 The external constraint</w:t>
-      </w:r>
-      <w:bookmarkStart w:id="11" w:name="literature-review"/>
-      <w:bookmarkEnd w:id="6"/>
-      <w:bookmarkEnd w:id="10"/>
+        <w:t>3.1 CGE studies of oil shocks in importing economies</w:t>
+      </w:r>
     </w:p>
     <w:p>
       <w:pPr>
         <w:pStyle w:val="Heading2"/>
-        <w:spacing w:after="120" w:line="360" w:lineRule="auto"/>
-        <w:jc w:val="both"/>
+        <w:spacing w:after="120"/>
         <w:rPr>
           <w:rFonts w:ascii="Times New Roman" w:eastAsia="Times New Roman" w:hAnsi="Times New Roman" w:cs="Times New Roman"/>
           <w:b w:val="0"/>
@@ -1661,6 +1810,8 @@
           <w:szCs w:val="24"/>
         </w:rPr>
       </w:pPr>
+      <w:bookmarkStart w:id="13" w:name="energy-and-cge-modelling-in-pakistan"/>
+      <w:bookmarkEnd w:id="12"/>
       <w:r>
         <w:rPr>
           <w:rFonts w:ascii="Times New Roman" w:eastAsia="Times New Roman" w:hAnsi="Times New Roman" w:cs="Times New Roman"/>
@@ -1670,23 +1821,13 @@
           <w:sz w:val="22"/>
           <w:szCs w:val="24"/>
         </w:rPr>
-        <w:t>There is not much scope in Pakistan's balance of payments to cover the additional bill from oil. The current account deficit was US$3.4 billion despite the US$19.9 billion in workers remittances (State Bank of Pakistan, 2016) in FY16. An increase in the energy bill, then, will have to be funded by either depreciation, a reduction in imports of other products, or new borrowing. The first two channels in the model at Section 5 are collected directly.</w:t>
+        <w:t xml:space="preserve">Ever since the 1980s, the effects of oil shocks have been a topic of investigation in the context of CGE models. The demand growth response to the second oil shock for four oil-poor developing countries has been analyzed early on, and a large expenditure switching response and real wage cuts were found to occur; the size of the response depended on the structure of the economy (Dick et al., 1984). Sánchez (2011), with the help of a dynamic CGE model, estimated that the increase in prices for oil products between 2002 and 2008 was responsible for approximately 2-3% loss of GDP per year for six importers of oil (including Bangladesh). </w:t>
       </w:r>
     </w:p>
     <w:p>
       <w:pPr>
         <w:pStyle w:val="Heading2"/>
         <w:spacing w:after="120"/>
-      </w:pPr>
-      <w:r>
-        <w:t>3. Literature review</w:t>
-      </w:r>
-    </w:p>
-    <w:p>
-      <w:pPr>
-        <w:pStyle w:val="Heading2"/>
-        <w:spacing w:after="120" w:line="360" w:lineRule="auto"/>
-        <w:jc w:val="both"/>
         <w:rPr>
           <w:rFonts w:ascii="Times New Roman" w:eastAsia="Times New Roman" w:hAnsi="Times New Roman" w:cs="Times New Roman"/>
           <w:b w:val="0"/>
@@ -1696,7 +1837,6 @@
           <w:szCs w:val="24"/>
         </w:rPr>
       </w:pPr>
-      <w:bookmarkStart w:id="12" w:name="Xaa0a8d10270b4b25343b4d637937724f85b9984"/>
       <w:r>
         <w:rPr>
           <w:rFonts w:ascii="Times New Roman" w:eastAsia="Times New Roman" w:hAnsi="Times New Roman" w:cs="Times New Roman"/>
@@ -1706,7 +1846,7 @@
           <w:sz w:val="22"/>
           <w:szCs w:val="24"/>
         </w:rPr>
-        <w:t xml:space="preserve">This paper is structured around three strands of work: </w:t>
+        <w:t>The energy-intensive importers, like India and China, are the most affected countries by increasing oil prices using a global recursive-dynamic CGE model with 25 regions (Timilsina, 2015). Similar channels are identified in single-country studies. The higher crude prices put an increase in the Indian prices and decrease in private consumption in India (</w:t>
       </w:r>
       <w:proofErr w:type="spellStart"/>
       <w:r>
@@ -1718,7 +1858,7 @@
           <w:sz w:val="22"/>
           <w:szCs w:val="24"/>
         </w:rPr>
-        <w:t>i</w:t>
+        <w:t>Mohanasundari</w:t>
       </w:r>
       <w:proofErr w:type="spellEnd"/>
       <w:r>
@@ -1730,7 +1870,7 @@
           <w:sz w:val="22"/>
           <w:szCs w:val="24"/>
         </w:rPr>
-        <w:t>) CGE impacts of the oil shocks on importing countries, ii) CGE and time series impacts of energy in Pakistan, and, iii) research in the new studies on 2026 oil shock of a Hormuz closure. None provides a recent Pakistan SAM coupled with a route specific Supply shock.</w:t>
+        <w:t xml:space="preserve"> et al., 2025). For instance, in Nigeria, fuel-subsidy CGE work reveals that: the shock falls on those who are least able to bear it when the policy is poorly determined. (Siddig et al., 2014)</w:t>
       </w:r>
     </w:p>
     <w:p>
@@ -1739,14 +1879,13 @@
         <w:spacing w:after="120"/>
       </w:pPr>
       <w:r>
-        <w:t>3.1 CGE studies of oil shocks in importing economies</w:t>
+        <w:t>3.2 Energy and CGE modelling in Pakistan</w:t>
       </w:r>
     </w:p>
     <w:p>
       <w:pPr>
         <w:pStyle w:val="Heading2"/>
-        <w:spacing w:after="120" w:line="360" w:lineRule="auto"/>
-        <w:jc w:val="both"/>
+        <w:spacing w:after="120"/>
         <w:rPr>
           <w:rFonts w:ascii="Times New Roman" w:eastAsia="Times New Roman" w:hAnsi="Times New Roman" w:cs="Times New Roman"/>
           <w:b w:val="0"/>
@@ -1756,8 +1895,8 @@
           <w:szCs w:val="24"/>
         </w:rPr>
       </w:pPr>
-      <w:bookmarkStart w:id="13" w:name="energy-and-cge-modelling-in-pakistan"/>
-      <w:bookmarkEnd w:id="12"/>
+      <w:bookmarkStart w:id="14" w:name="the-2026-hormuz-closure"/>
+      <w:bookmarkEnd w:id="13"/>
       <w:r>
         <w:rPr>
           <w:rFonts w:ascii="Times New Roman" w:eastAsia="Times New Roman" w:hAnsi="Times New Roman" w:cs="Times New Roman"/>
@@ -1767,14 +1906,10 @@
           <w:sz w:val="22"/>
           <w:szCs w:val="24"/>
         </w:rPr>
-        <w:t xml:space="preserve">Ever since the 1980s, the effects of oil shocks have been a topic of investigation in the context of CGE models. The demand growth response to the second oil shock for four oil-poor developing countries has been analyzed early on, and a large expenditure switching response and real wage cuts were found to occur; the size of the response depended on the structure of the economy (Dick et al., 1984). Sánchez (2011), with the help of a dynamic CGE model, estimated that the increase in prices for oil products between 2002 and 2008 was responsible for approximately 2-3% loss of GDP per year for six importers of oil (including Bangladesh). </w:t>
-      </w:r>
-    </w:p>
-    <w:p>
-      <w:pPr>
-        <w:pStyle w:val="Heading2"/>
-        <w:spacing w:after="120" w:line="360" w:lineRule="auto"/>
-        <w:jc w:val="both"/>
+        <w:t xml:space="preserve">GE-PAK, the first energy CGE model for Pakistan, was a static model that was not only energy-based, but also incorporated trade and equity (Naqvi, 1998). Several studies have analyzed the effect of carbon taxation and energy efficiency in Pakistan using a 20 sector CGE model (Mahmood and </w:t>
+      </w:r>
+      <w:proofErr w:type="spellStart"/>
+      <w:r>
         <w:rPr>
           <w:rFonts w:ascii="Times New Roman" w:eastAsia="Times New Roman" w:hAnsi="Times New Roman" w:cs="Times New Roman"/>
           <w:b w:val="0"/>
@@ -1783,7 +1918,9 @@
           <w:sz w:val="22"/>
           <w:szCs w:val="24"/>
         </w:rPr>
-      </w:pPr>
+        <w:t>Marpaung</w:t>
+      </w:r>
+      <w:proofErr w:type="spellEnd"/>
       <w:r>
         <w:rPr>
           <w:rFonts w:ascii="Times New Roman" w:eastAsia="Times New Roman" w:hAnsi="Times New Roman" w:cs="Times New Roman"/>
@@ -1793,24 +1930,10 @@
           <w:sz w:val="22"/>
           <w:szCs w:val="24"/>
         </w:rPr>
-        <w:lastRenderedPageBreak/>
-        <w:t>The energy-intensive importers, like India and China, are the most affected countries by increasing oil prices using a global recursive-dynamic CGE model with 25 regions (Timilsina, 2015). Similar channels are identified in single-country studies. The higher crude prices put an increase in the Indian prices and decrease in private consumption in India (Mohanasundari et al., 2025). For instance, in Nigeria, fuel-subsidy CGE work reveals that: the shock falls on those who are least able to bear it when the policy is poorly determined. (Siddig et al., 2014)</w:t>
-      </w:r>
-    </w:p>
-    <w:p>
-      <w:pPr>
-        <w:pStyle w:val="Heading2"/>
-        <w:spacing w:after="120"/>
-      </w:pPr>
-      <w:r>
-        <w:t>3.2 Energy and CGE modelling in Pakistan</w:t>
-      </w:r>
-    </w:p>
-    <w:p>
-      <w:pPr>
-        <w:pStyle w:val="Heading2"/>
-        <w:spacing w:after="120" w:line="360" w:lineRule="auto"/>
-        <w:jc w:val="both"/>
+        <w:t>, 2014) and recent studies have focused on the efficiency cost of taxation (Khan et al., 2025). These studies are based on outdated SAMs, with the most comprehensive of these studies, applied to 2007-08, comprising 51 sectors and 18 household groups (</w:t>
+      </w:r>
+      <w:proofErr w:type="spellStart"/>
+      <w:r>
         <w:rPr>
           <w:rFonts w:ascii="Times New Roman" w:eastAsia="Times New Roman" w:hAnsi="Times New Roman" w:cs="Times New Roman"/>
           <w:b w:val="0"/>
@@ -1819,9 +1942,9 @@
           <w:sz w:val="22"/>
           <w:szCs w:val="24"/>
         </w:rPr>
-      </w:pPr>
-      <w:bookmarkStart w:id="14" w:name="the-2026-hormuz-closure"/>
-      <w:bookmarkEnd w:id="13"/>
+        <w:t>Debowicz</w:t>
+      </w:r>
+      <w:proofErr w:type="spellEnd"/>
       <w:r>
         <w:rPr>
           <w:rFonts w:ascii="Times New Roman" w:eastAsia="Times New Roman" w:hAnsi="Times New Roman" w:cs="Times New Roman"/>
@@ -1831,14 +1954,13 @@
           <w:sz w:val="22"/>
           <w:szCs w:val="24"/>
         </w:rPr>
-        <w:t xml:space="preserve">GE-PAK, the first energy CGE model for Pakistan, was a static model that was not only energy-based, but also incorporated trade and equity (Naqvi, 1998). Several studies have analyzed the effect of carbon taxation and energy efficiency in Pakistan using a 20 sector CGE model (Mahmood and Marpaung, 2014) and recent studies have focused on the efficiency cost of taxation (Khan et al., 2025). These studies are based on outdated SAMs, with the most comprehensive of these studies, applied to 2007-08, comprising 51 sectors and 18 household groups (Debowicz et al., 2012). </w:t>
+        <w:t xml:space="preserve"> et al., 2012). </w:t>
       </w:r>
     </w:p>
     <w:p>
       <w:pPr>
         <w:pStyle w:val="Heading2"/>
-        <w:spacing w:after="120" w:line="360" w:lineRule="auto"/>
-        <w:jc w:val="both"/>
+        <w:spacing w:after="120"/>
         <w:rPr>
           <w:rFonts w:ascii="Times New Roman" w:eastAsia="Times New Roman" w:hAnsi="Times New Roman" w:cs="Times New Roman"/>
           <w:b w:val="0"/>
@@ -1857,6 +1979,7 @@
           <w:sz w:val="22"/>
           <w:szCs w:val="24"/>
         </w:rPr>
+        <w:lastRenderedPageBreak/>
         <w:t>The evidence for oil shocks in Pakistan reported is for the most part from time-series models. One structural VAR showed that there were potent macroeconomic impacts on the world's price shock to food and oil (Khan and Ahmed, 2011), while the rise in energy prices was seen to reduce the consumer welfare (Aziz et al., 2016). These approaches are valid for measuring pass-through, but not sectoral reallocation or household incomes.</w:t>
       </w:r>
     </w:p>
@@ -1872,8 +1995,7 @@
     <w:p>
       <w:pPr>
         <w:pStyle w:val="Heading2"/>
-        <w:spacing w:after="120" w:line="360" w:lineRule="auto"/>
-        <w:jc w:val="both"/>
+        <w:spacing w:after="120"/>
         <w:rPr>
           <w:rFonts w:ascii="Times New Roman" w:eastAsia="Times New Roman" w:hAnsi="Times New Roman" w:cs="Times New Roman"/>
           <w:b w:val="0"/>
@@ -1909,7 +2031,7 @@
     <w:p>
       <w:pPr>
         <w:pStyle w:val="Heading1"/>
-        <w:spacing w:after="120" w:line="360" w:lineRule="auto"/>
+        <w:spacing w:after="120"/>
         <w:rPr>
           <w:rFonts w:ascii="Times New Roman" w:eastAsia="Times New Roman" w:hAnsi="Times New Roman" w:cs="Times New Roman"/>
           <w:b w:val="0"/>
@@ -1931,11 +2053,41 @@
           <w:sz w:val="22"/>
           <w:szCs w:val="24"/>
         </w:rPr>
+        <w:t>This paper is an assemblage of these. The model is developed using a single-country CGE model (as are the previous models) but calibrated onto official 2015 and 2016 PBS tables and the 2026 Hormuz price shock from 3.3. We experience an 2.3–2.5 loss in welfare at the peak shock which is within Kiel's suggested range of 1.8–3.5% for the South Asian region, and connect in-depth sectoral, labor-market and household context, which is not available in the global models.</w:t>
+      </w:r>
+    </w:p>
+    <w:p>
+      <w:pPr>
+        <w:pStyle w:val="Heading1"/>
+        <w:spacing w:after="120"/>
+      </w:pPr>
+    </w:p>
+    <w:p>
+      <w:pPr>
+        <w:pStyle w:val="Heading1"/>
+        <w:spacing w:after="120"/>
+      </w:pPr>
+    </w:p>
+    <w:p>
+      <w:pPr>
+        <w:pStyle w:val="Heading1"/>
+        <w:spacing w:after="120"/>
+      </w:pPr>
+    </w:p>
+    <w:p>
+      <w:pPr>
+        <w:pStyle w:val="Heading1"/>
+        <w:spacing w:after="120"/>
+      </w:pPr>
+      <w:r>
         <w:lastRenderedPageBreak/>
-        <w:t xml:space="preserve">This paper is an assemblage of these. The model is developed using a single-country CGE model (as are the previous models) but calibrated onto official 2015 and 2016 PBS tables and the 2026 Hormuz price shock from 3.3. We experience </w:t>
-      </w:r>
-      <w:proofErr w:type="gramStart"/>
-      <w:r>
+        <w:t>4. Data: a 2015-16 SAM for Pakistan</w:t>
+      </w:r>
+    </w:p>
+    <w:p>
+      <w:pPr>
+        <w:pStyle w:val="Heading2"/>
+        <w:spacing w:after="120"/>
         <w:rPr>
           <w:rFonts w:ascii="Times New Roman" w:eastAsia="Times New Roman" w:hAnsi="Times New Roman" w:cs="Times New Roman"/>
           <w:b w:val="0"/>
@@ -1944,9 +2096,8 @@
           <w:sz w:val="22"/>
           <w:szCs w:val="24"/>
         </w:rPr>
-        <w:t>an</w:t>
-      </w:r>
-      <w:proofErr w:type="gramEnd"/>
+      </w:pPr>
+      <w:bookmarkStart w:id="17" w:name="accounts"/>
       <w:r>
         <w:rPr>
           <w:rFonts w:ascii="Times New Roman" w:eastAsia="Times New Roman" w:hAnsi="Times New Roman" w:cs="Times New Roman"/>
@@ -1956,23 +2107,10 @@
           <w:sz w:val="22"/>
           <w:szCs w:val="24"/>
         </w:rPr>
-        <w:t xml:space="preserve"> 2.3–2.5 loss in welfare at the peak shock which is within Kiel's suggested range of 1.8–3.5% for the South Asian region, and connect in-depth sectoral, labor-market and household context, which is not available in the global models.</w:t>
-      </w:r>
-    </w:p>
-    <w:p>
-      <w:pPr>
-        <w:pStyle w:val="Heading1"/>
-        <w:spacing w:after="120"/>
-      </w:pPr>
-      <w:r>
-        <w:t>4. Data: a 2015-16 SAM for Pakistan</w:t>
-      </w:r>
-    </w:p>
-    <w:p>
-      <w:pPr>
-        <w:pStyle w:val="Heading2"/>
-        <w:spacing w:after="120" w:line="360" w:lineRule="auto"/>
-        <w:jc w:val="both"/>
+        <w:t xml:space="preserve">For the </w:t>
+      </w:r>
+      <w:proofErr w:type="spellStart"/>
+      <w:r>
         <w:rPr>
           <w:rFonts w:ascii="Times New Roman" w:eastAsia="Times New Roman" w:hAnsi="Times New Roman" w:cs="Times New Roman"/>
           <w:b w:val="0"/>
@@ -1981,8 +2119,9 @@
           <w:sz w:val="22"/>
           <w:szCs w:val="24"/>
         </w:rPr>
-      </w:pPr>
-      <w:bookmarkStart w:id="17" w:name="accounts"/>
+        <w:t>centre</w:t>
+      </w:r>
+      <w:proofErr w:type="spellEnd"/>
       <w:r>
         <w:rPr>
           <w:rFonts w:ascii="Times New Roman" w:eastAsia="Times New Roman" w:hAnsi="Times New Roman" w:cs="Times New Roman"/>
@@ -1992,7 +2131,7 @@
           <w:sz w:val="22"/>
           <w:szCs w:val="24"/>
         </w:rPr>
-        <w:t>For the centre year 2015-16, we develop a new SAM with 15 accounts, to make a new balanced SAM for Pakistan. It is the first edition from one SAM with official data supplied by the PBS Tables (Table of Supply-Use and Table of Input-Output) for that year; all entries can be identified as originating at a published source.</w:t>
+        <w:t xml:space="preserve"> year 2015-16, we develop a new SAM with 15 accounts, to make a new balanced SAM for Pakistan. It is the first edition from one SAM with official data supplied by the PBS Tables (Table of Supply-Use and Table of Input-Output) for that year; all entries can be identified as originating at a published source.</w:t>
       </w:r>
     </w:p>
     <w:p>
@@ -2174,11 +2313,19 @@
               <w:pStyle w:val="Compact"/>
               <w:spacing w:after="0"/>
             </w:pPr>
-            <w:r>
-              <w:rPr>
-                <w:sz w:val="18"/>
-              </w:rPr>
-              <w:t>Labour, Capital</w:t>
+            <w:proofErr w:type="spellStart"/>
+            <w:r>
+              <w:rPr>
+                <w:sz w:val="18"/>
+              </w:rPr>
+              <w:t>Labour</w:t>
+            </w:r>
+            <w:proofErr w:type="spellEnd"/>
+            <w:r>
+              <w:rPr>
+                <w:sz w:val="18"/>
+              </w:rPr>
+              <w:t>, Capital</w:t>
             </w:r>
           </w:p>
         </w:tc>
@@ -2259,8 +2406,7 @@
     <w:p>
       <w:pPr>
         <w:pStyle w:val="BodyText"/>
-        <w:spacing w:after="120" w:line="360" w:lineRule="auto"/>
-        <w:jc w:val="both"/>
+        <w:spacing w:after="120"/>
       </w:pPr>
       <w:r>
         <w:t>Energy is a separate sector because the Hormuz shock enters through energy imports. It covers mining (PSIC 05–09), petroleum refining (PSIC 19) and electricity and gas supply (PSIC 35). Agriculture covers PSIC 01–03, Manufacturing covers PSIC 10–33 excluding refining, and Services covers everything else.</w:t>
@@ -2394,28 +2540,50 @@
               <w:pStyle w:val="Compact"/>
               <w:spacing w:after="0"/>
             </w:pPr>
-            <w:r>
-              <w:rPr>
-                <w:sz w:val="18"/>
-              </w:rPr>
-              <w:t>Labour vs capital split of value added</w:t>
-            </w:r>
-          </w:p>
-        </w:tc>
-        <w:tc>
-          <w:tcPr>
-            <w:tcW w:w="0" w:type="auto"/>
-          </w:tcPr>
-          <w:p>
-            <w:pPr>
-              <w:pStyle w:val="Compact"/>
-              <w:spacing w:after="0"/>
-            </w:pPr>
-            <w:r>
-              <w:rPr>
-                <w:sz w:val="18"/>
-              </w:rPr>
-              <w:t>PBS Labour Force Survey 2014-15 (employment and wages by industry)</w:t>
+            <w:proofErr w:type="spellStart"/>
+            <w:r>
+              <w:rPr>
+                <w:sz w:val="18"/>
+              </w:rPr>
+              <w:t>Labour</w:t>
+            </w:r>
+            <w:proofErr w:type="spellEnd"/>
+            <w:r>
+              <w:rPr>
+                <w:sz w:val="18"/>
+              </w:rPr>
+              <w:t xml:space="preserve"> vs capital split of value added</w:t>
+            </w:r>
+          </w:p>
+        </w:tc>
+        <w:tc>
+          <w:tcPr>
+            <w:tcW w:w="0" w:type="auto"/>
+          </w:tcPr>
+          <w:p>
+            <w:pPr>
+              <w:pStyle w:val="Compact"/>
+              <w:spacing w:after="0"/>
+            </w:pPr>
+            <w:r>
+              <w:rPr>
+                <w:sz w:val="18"/>
+              </w:rPr>
+              <w:t xml:space="preserve">PBS </w:t>
+            </w:r>
+            <w:proofErr w:type="spellStart"/>
+            <w:r>
+              <w:rPr>
+                <w:sz w:val="18"/>
+              </w:rPr>
+              <w:t>Labour</w:t>
+            </w:r>
+            <w:proofErr w:type="spellEnd"/>
+            <w:r>
+              <w:rPr>
+                <w:sz w:val="18"/>
+              </w:rPr>
+              <w:t xml:space="preserve"> Force Survey 2014-15 (employment and wages by industry)</w:t>
             </w:r>
           </w:p>
         </w:tc>
@@ -2543,8 +2711,7 @@
     <w:p>
       <w:pPr>
         <w:pStyle w:val="FirstParagraph"/>
-        <w:spacing w:after="120" w:line="360" w:lineRule="auto"/>
-        <w:jc w:val="both"/>
+        <w:spacing w:after="120"/>
       </w:pPr>
       <w:r>
         <w:rPr>
@@ -2563,8 +2730,7 @@
     <w:p>
       <w:pPr>
         <w:pStyle w:val="FirstParagraph"/>
-        <w:spacing w:after="120" w:line="360" w:lineRule="auto"/>
-        <w:jc w:val="both"/>
+        <w:spacing w:after="120"/>
       </w:pPr>
       <w:r>
         <w:rPr>
@@ -2596,8 +2762,7 @@
     <w:p>
       <w:pPr>
         <w:pStyle w:val="FirstParagraph"/>
-        <w:spacing w:after="120" w:line="360" w:lineRule="auto"/>
-        <w:jc w:val="both"/>
+        <w:spacing w:after="120"/>
       </w:pPr>
       <w:r>
         <w:rPr>
@@ -2622,15 +2787,7 @@
         <w:t>Labor</w:t>
       </w:r>
       <w:r>
-        <w:t xml:space="preserve"> income in urban </w:t>
-      </w:r>
-      <w:proofErr w:type="gramStart"/>
-      <w:r>
-        <w:t>households</w:t>
-      </w:r>
-      <w:proofErr w:type="gramEnd"/>
-      <w:r>
-        <w:t xml:space="preserve"> accounts for 49% of total household </w:t>
+        <w:t xml:space="preserve"> income in urban households accounts for 49% of total household </w:t>
       </w:r>
       <w:r>
         <w:t>labor</w:t>
@@ -2642,8 +2799,7 @@
     <w:p>
       <w:pPr>
         <w:pStyle w:val="FirstParagraph"/>
-        <w:spacing w:after="120" w:line="360" w:lineRule="auto"/>
-        <w:jc w:val="both"/>
+        <w:spacing w:after="120"/>
       </w:pPr>
       <w:r>
         <w:rPr>
@@ -2662,8 +2818,7 @@
     <w:p>
       <w:pPr>
         <w:pStyle w:val="FirstParagraph"/>
-        <w:spacing w:after="120" w:line="360" w:lineRule="auto"/>
-        <w:jc w:val="both"/>
+        <w:spacing w:after="120"/>
       </w:pPr>
       <w:r>
         <w:rPr>
@@ -2964,8 +3119,8 @@
     <w:p>
       <w:pPr>
         <w:pStyle w:val="Heading2"/>
-        <w:spacing w:after="120" w:line="360" w:lineRule="auto"/>
-        <w:jc w:val="both"/>
+        <w:pageBreakBefore/>
+        <w:spacing w:before="100" w:beforeAutospacing="1" w:after="120"/>
         <w:rPr>
           <w:rFonts w:ascii="Times New Roman" w:eastAsia="Times New Roman" w:hAnsi="Times New Roman" w:cs="Times New Roman"/>
           <w:b w:val="0"/>
@@ -3002,7 +3157,7 @@
     <w:p>
       <w:pPr>
         <w:pStyle w:val="Heading1"/>
-        <w:spacing w:after="120" w:line="360" w:lineRule="auto"/>
+        <w:spacing w:after="120"/>
         <w:rPr>
           <w:rFonts w:ascii="Times New Roman" w:eastAsia="Times New Roman" w:hAnsi="Times New Roman" w:cs="Times New Roman"/>
           <w:b w:val="0"/>
@@ -3083,8 +3238,7 @@
     <w:p>
       <w:pPr>
         <w:pStyle w:val="Heading2"/>
-        <w:spacing w:after="120" w:line="360" w:lineRule="auto"/>
-        <w:jc w:val="both"/>
+        <w:spacing w:after="120"/>
         <w:rPr>
           <w:rFonts w:ascii="Times New Roman" w:eastAsia="Times New Roman" w:hAnsi="Times New Roman" w:cs="Times New Roman"/>
           <w:b w:val="0"/>
@@ -3344,7 +3498,15 @@
         <w:spacing w:after="120"/>
       </w:pPr>
       <w:r>
-        <w:t xml:space="preserve">Value added is Cobb-Douglas in labour </w:t>
+        <w:t xml:space="preserve">Value added is Cobb-Douglas in </w:t>
+      </w:r>
+      <w:proofErr w:type="spellStart"/>
+      <w:r>
+        <w:t>labour</w:t>
+      </w:r>
+      <w:proofErr w:type="spellEnd"/>
+      <w:r>
+        <w:t xml:space="preserve"> </w:t>
       </w:r>
       <m:oMath>
         <m:sSub>
@@ -3634,7 +3796,15 @@
         <w:spacing w:after="120"/>
       </w:pPr>
       <w:r>
-        <w:t>Firms hire labour until its marginal value equals the wage, and capital earns the residual:</w:t>
+        <w:t xml:space="preserve">Firms hire </w:t>
+      </w:r>
+      <w:proofErr w:type="spellStart"/>
+      <w:r>
+        <w:t>labour</w:t>
+      </w:r>
+      <w:proofErr w:type="spellEnd"/>
+      <w:r>
+        <w:t xml:space="preserve"> until its marginal value equals the wage, and capital earns the residual:</w:t>
       </w:r>
     </w:p>
     <w:p>
@@ -4343,6 +4513,7 @@
       <w:bookmarkStart w:id="24" w:name="trade"/>
       <w:bookmarkEnd w:id="23"/>
       <w:r>
+        <w:lastRenderedPageBreak/>
         <w:t>5.2 Trade</w:t>
       </w:r>
     </w:p>
@@ -4748,7 +4919,6 @@
         <w:spacing w:after="120"/>
       </w:pPr>
       <w:r>
-        <w:lastRenderedPageBreak/>
         <w:t xml:space="preserve">Buyers combine domestic goods and imports </w:t>
       </w:r>
       <m:oMath>
@@ -6107,8 +6277,7 @@
     <w:p>
       <w:pPr>
         <w:pStyle w:val="FirstParagraph"/>
-        <w:spacing w:after="120" w:line="360" w:lineRule="auto"/>
-        <w:jc w:val="both"/>
+        <w:spacing w:after="120"/>
       </w:pPr>
       <w:r>
         <w:t>Government revenue comes from indirect, direct, export and investment taxes. Real government consumption and transfers are fixed, so government saving adjusts.</w:t>
@@ -6117,8 +6286,7 @@
     <w:p>
       <w:pPr>
         <w:pStyle w:val="BodyText"/>
-        <w:spacing w:after="120" w:line="360" w:lineRule="auto"/>
-        <w:jc w:val="both"/>
+        <w:spacing w:after="120"/>
       </w:pPr>
       <w:r>
         <w:t>Investment is savings-driven. Total savings from households, government and abroad is spent on investment goods in fixed value shares.</w:t>
@@ -6127,8 +6295,7 @@
     <w:p>
       <w:pPr>
         <w:pStyle w:val="BodyText"/>
-        <w:spacing w:after="120" w:line="360" w:lineRule="auto"/>
-        <w:jc w:val="both"/>
+        <w:spacing w:after="120"/>
       </w:pPr>
       <w:r>
         <w:t>Foreign savings are fixed in dollars. The exchange rate adjusts to balance the current account:</w:t>
@@ -6586,11 +6753,9 @@
       <w:r>
         <w:t xml:space="preserve">Each composite good </w:t>
       </w:r>
-      <w:proofErr w:type="gramStart"/>
-      <w:r>
-        <w:t>clears</w:t>
-      </w:r>
-      <w:proofErr w:type="gramEnd"/>
+      <w:r>
+        <w:t>clear</w:t>
+      </w:r>
       <w:r>
         <w:t>:</w:t>
       </w:r>
@@ -6881,8 +7046,7 @@
     <w:p>
       <w:pPr>
         <w:pStyle w:val="FirstParagraph"/>
-        <w:spacing w:after="120" w:line="360" w:lineRule="auto"/>
-        <w:jc w:val="both"/>
+        <w:spacing w:after="120"/>
       </w:pPr>
       <w:r>
         <w:t>The CPI is the numeraire, fixed at one. A Walras slack variable confirms that the system is consistent, and it equals zero in every solution.</w:t>
@@ -6891,11 +7055,18 @@
     <w:p>
       <w:pPr>
         <w:pStyle w:val="BodyText"/>
-        <w:spacing w:after="120" w:line="360" w:lineRule="auto"/>
-        <w:jc w:val="both"/>
-      </w:pPr>
-      <w:r>
-        <w:t>We use two labour-market closures:</w:t>
+        <w:spacing w:after="120"/>
+      </w:pPr>
+      <w:r>
+        <w:t xml:space="preserve">We use two </w:t>
+      </w:r>
+      <w:proofErr w:type="spellStart"/>
+      <w:r>
+        <w:t>labour</w:t>
+      </w:r>
+      <w:proofErr w:type="spellEnd"/>
+      <w:r>
+        <w:t>-market closures:</w:t>
       </w:r>
     </w:p>
     <w:p>
@@ -6908,8 +7079,23 @@
           <w:b/>
           <w:bCs/>
         </w:rPr>
-        <w:lastRenderedPageBreak/>
-        <w:t>Table 6. Labour-market closures</w:t>
+        <w:t xml:space="preserve">Table 6. </w:t>
+      </w:r>
+      <w:proofErr w:type="spellStart"/>
+      <w:r>
+        <w:rPr>
+          <w:b/>
+          <w:bCs/>
+        </w:rPr>
+        <w:t>Labour</w:t>
+      </w:r>
+      <w:proofErr w:type="spellEnd"/>
+      <w:r>
+        <w:rPr>
+          <w:b/>
+          <w:bCs/>
+        </w:rPr>
+        <w:t>-market closures</w:t>
       </w:r>
     </w:p>
     <w:tbl>
@@ -7044,7 +7230,21 @@
               <w:rPr>
                 <w:sz w:val="18"/>
               </w:rPr>
-              <w:t>Fixed at the labour force</w:t>
+              <w:t xml:space="preserve">Fixed at the </w:t>
+            </w:r>
+            <w:proofErr w:type="spellStart"/>
+            <w:r>
+              <w:rPr>
+                <w:sz w:val="18"/>
+              </w:rPr>
+              <w:t>labour</w:t>
+            </w:r>
+            <w:proofErr w:type="spellEnd"/>
+            <w:r>
+              <w:rPr>
+                <w:sz w:val="18"/>
+              </w:rPr>
+              <w:t xml:space="preserve"> force</w:t>
             </w:r>
           </w:p>
         </w:tc>
@@ -7114,11 +7314,18 @@
     <w:p>
       <w:pPr>
         <w:pStyle w:val="BodyText"/>
-        <w:spacing w:after="120" w:line="360" w:lineRule="auto"/>
-        <w:jc w:val="both"/>
-      </w:pPr>
-      <w:r>
-        <w:t>The UNEMP closure fits Pakistan’s large informal labour market and rigid formal wages better, so it is our central case.</w:t>
+        <w:spacing w:after="120"/>
+      </w:pPr>
+      <w:r>
+        <w:t xml:space="preserve">The UNEMP closure fits Pakistan’s large informal </w:t>
+      </w:r>
+      <w:proofErr w:type="spellStart"/>
+      <w:r>
+        <w:t>labour</w:t>
+      </w:r>
+      <w:proofErr w:type="spellEnd"/>
+      <w:r>
+        <w:t xml:space="preserve"> market and rigid formal wages better, so it is our central case.</w:t>
       </w:r>
     </w:p>
     <w:p>
@@ -7135,8 +7342,7 @@
     <w:p>
       <w:pPr>
         <w:pStyle w:val="BodyText"/>
-        <w:spacing w:after="120" w:line="360" w:lineRule="auto"/>
-        <w:jc w:val="both"/>
+        <w:spacing w:after="120"/>
       </w:pPr>
       <w:r>
         <w:t>All the parameters of share, scale are calibrated such that the model reproduces the SAM exactly. In the benchmark replication test, all variables return to their base values, with no deviations and no Walras slack.</w:t>
@@ -7445,8 +7651,7 @@
     <w:p>
       <w:pPr>
         <w:pStyle w:val="Heading1"/>
-        <w:spacing w:after="120" w:line="360" w:lineRule="auto"/>
-        <w:jc w:val="both"/>
+        <w:spacing w:after="120"/>
         <w:rPr>
           <w:rFonts w:ascii="Times New Roman" w:eastAsia="Times New Roman" w:hAnsi="Times New Roman" w:cs="Times New Roman"/>
           <w:b w:val="0"/>
@@ -7468,6 +7673,7 @@
           <w:sz w:val="22"/>
           <w:szCs w:val="24"/>
         </w:rPr>
+        <w:lastRenderedPageBreak/>
         <w:t>The energy Armington elasticity is imposed to be very close to zero (0.1). Energy cannot be substituted with domestic sources in the short run since domestic refineries and power stations rely on imports. This has a higher value (0.56) and predicts that domestic energy output increases following the shock, which is incorrect. The values on the other terms follow ranges typical of the developing country CGE applications (Lofgren et al., 2002), and are tested in Section 8.</w:t>
       </w:r>
     </w:p>
@@ -7476,18 +7682,86 @@
         <w:pStyle w:val="Heading1"/>
         <w:spacing w:after="120"/>
       </w:pPr>
-      <w:r>
+    </w:p>
+    <w:p>
+      <w:pPr>
+        <w:pStyle w:val="Heading1"/>
+        <w:spacing w:after="120"/>
+      </w:pPr>
+    </w:p>
+    <w:p>
+      <w:pPr>
+        <w:pStyle w:val="Heading1"/>
+        <w:spacing w:after="120"/>
+      </w:pPr>
+    </w:p>
+    <w:p>
+      <w:pPr>
+        <w:pStyle w:val="Heading1"/>
+        <w:spacing w:after="120"/>
+      </w:pPr>
+    </w:p>
+    <w:p>
+      <w:pPr>
+        <w:pStyle w:val="Heading1"/>
+        <w:spacing w:after="120"/>
+      </w:pPr>
+    </w:p>
+    <w:p>
+      <w:pPr>
+        <w:pStyle w:val="Heading1"/>
+        <w:spacing w:after="120"/>
+      </w:pPr>
+    </w:p>
+    <w:p>
+      <w:pPr>
+        <w:pStyle w:val="Heading1"/>
+        <w:spacing w:after="120"/>
+      </w:pPr>
+    </w:p>
+    <w:p>
+      <w:pPr>
+        <w:pStyle w:val="Heading1"/>
+        <w:spacing w:after="120"/>
+      </w:pPr>
+    </w:p>
+    <w:p>
+      <w:pPr>
+        <w:pStyle w:val="Heading1"/>
+        <w:spacing w:after="120"/>
+      </w:pPr>
+    </w:p>
+    <w:p>
+      <w:pPr>
+        <w:pStyle w:val="Heading1"/>
+        <w:spacing w:after="120"/>
+      </w:pPr>
+    </w:p>
+    <w:p>
+      <w:pPr>
+        <w:pStyle w:val="Heading1"/>
+        <w:spacing w:after="120"/>
+      </w:pPr>
+      <w:r>
+        <w:lastRenderedPageBreak/>
         <w:t>6. Shock scenarios</w:t>
       </w:r>
     </w:p>
     <w:p>
       <w:pPr>
         <w:pStyle w:val="BodyText"/>
-        <w:spacing w:after="120" w:line="360" w:lineRule="auto"/>
-        <w:jc w:val="both"/>
-      </w:pPr>
-      <w:r>
-        <w:t>To model the Hormuz disruption the world price of Pakistan's energy imports is modeled as rasing. Scarcity is not modelled, but rather represented by a price rise.</w:t>
+        <w:spacing w:after="120"/>
+      </w:pPr>
+      <w:r>
+        <w:t xml:space="preserve">To model the Hormuz disruption the world price of Pakistan's energy imports is modeled as </w:t>
+      </w:r>
+      <w:proofErr w:type="spellStart"/>
+      <w:r>
+        <w:t>rasing</w:t>
+      </w:r>
+      <w:proofErr w:type="spellEnd"/>
+      <w:r>
+        <w:t>. Scarcity is not modelled, but rather represented by a price rise.</w:t>
       </w:r>
     </w:p>
     <w:p>
@@ -7748,73 +8022,88 @@
     <w:p>
       <w:pPr>
         <w:pStyle w:val="BodyText"/>
-        <w:spacing w:after="120" w:line="360" w:lineRule="auto"/>
-        <w:jc w:val="both"/>
-      </w:pPr>
-      <w:r>
-        <w:t xml:space="preserve">They averaged US$145 per barrel in 2026, a significant increase from their starting price of around US$70 in the same month, during the peak of the crude price surge (The News, 2026). Our shocks are lower than this because they are not as severe as to be applicable to the whole energy import basket (Liquefied Natural Gas or LNG and other fuels which are purchased under long term, as well as short </w:t>
-      </w:r>
-      <w:r>
-        <w:lastRenderedPageBreak/>
-        <w:t>term, contracts) and because they are also for ongoing prices, not peak prices. The case +71% is a serious, but plausible, sustained shock; whereas the case +30 % is moderate.</w:t>
-      </w:r>
-    </w:p>
-    <w:p>
-      <w:pPr>
-        <w:pStyle w:val="Heading1"/>
-        <w:spacing w:after="120" w:line="360" w:lineRule="auto"/>
-        <w:jc w:val="both"/>
-        <w:rPr>
-          <w:rFonts w:ascii="Times New Roman" w:eastAsia="Times New Roman" w:hAnsi="Times New Roman" w:cs="Times New Roman"/>
-          <w:b w:val="0"/>
-          <w:bCs w:val="0"/>
-          <w:color w:val="auto"/>
-          <w:sz w:val="22"/>
-          <w:szCs w:val="24"/>
-        </w:rPr>
-      </w:pPr>
+        <w:spacing w:after="120"/>
+      </w:pPr>
+      <w:r>
+        <w:t>They averaged US$145 per barrel in 2026, a significant increase from their starting price of around US$70 in the same month, during the peak of the crude price surge (The News, 2026). Our shocks are lower than this because they are not as severe as to be applicable to the whole energy import basket (Liquefied Natural Gas or LNG and other fuels which are purchased under long term, as well as short term, contracts) and because they are also for ongoing prices, not peak prices. The case +71% is a serious, but plausible, sustained shock; whereas the case +30 % is moderate.</w:t>
+      </w:r>
       <w:bookmarkStart w:id="30" w:name="results"/>
       <w:bookmarkEnd w:id="29"/>
-      <w:r>
-        <w:rPr>
-          <w:rFonts w:ascii="Times New Roman" w:eastAsia="Times New Roman" w:hAnsi="Times New Roman" w:cs="Times New Roman"/>
-          <w:b w:val="0"/>
-          <w:bCs w:val="0"/>
-          <w:color w:val="auto"/>
-          <w:sz w:val="22"/>
-          <w:szCs w:val="24"/>
-        </w:rPr>
+    </w:p>
+    <w:p>
+      <w:pPr>
+        <w:pStyle w:val="BodyText"/>
+        <w:spacing w:after="0"/>
+        <w:rPr>
+          <w:b/>
+          <w:bCs/>
+        </w:rPr>
+      </w:pPr>
+      <w:r>
         <w:t xml:space="preserve">The two rest of </w:t>
       </w:r>
       <w:r>
-        <w:rPr>
-          <w:rFonts w:ascii="Times New Roman" w:eastAsia="Times New Roman" w:hAnsi="Times New Roman" w:cs="Times New Roman"/>
-          <w:b w:val="0"/>
-          <w:bCs w:val="0"/>
-          <w:color w:val="auto"/>
-          <w:sz w:val="22"/>
-          <w:szCs w:val="24"/>
-        </w:rPr>
         <w:t>labor</w:t>
       </w:r>
       <w:r>
-        <w:rPr>
-          <w:rFonts w:ascii="Times New Roman" w:eastAsia="Times New Roman" w:hAnsi="Times New Roman" w:cs="Times New Roman"/>
-          <w:b w:val="0"/>
-          <w:bCs w:val="0"/>
-          <w:color w:val="auto"/>
-          <w:sz w:val="22"/>
-          <w:szCs w:val="24"/>
-        </w:rPr>
         <w:t>-market closures (UNEMP and FULL) are applied to each scenario, resulting in six runs. The other world prices, remittances in dollars, foreign savings and government consumption and transfers remain at base levels. Each iteration computes a local optimum solution (slack &lt; 1e-6 Walras).</w:t>
       </w:r>
     </w:p>
     <w:p>
       <w:pPr>
         <w:pStyle w:val="Heading1"/>
-        <w:spacing w:after="120"/>
-      </w:pPr>
-      <w:r>
+        <w:spacing w:before="0" w:line="240" w:lineRule="auto"/>
+      </w:pPr>
+    </w:p>
+    <w:p>
+      <w:pPr>
+        <w:pStyle w:val="Heading1"/>
+        <w:spacing w:before="0" w:line="240" w:lineRule="auto"/>
+      </w:pPr>
+    </w:p>
+    <w:p>
+      <w:pPr>
+        <w:pStyle w:val="Heading1"/>
+        <w:spacing w:before="0" w:line="240" w:lineRule="auto"/>
+      </w:pPr>
+    </w:p>
+    <w:p>
+      <w:pPr>
+        <w:pStyle w:val="BodyText"/>
+      </w:pPr>
+    </w:p>
+    <w:p>
+      <w:pPr>
+        <w:pStyle w:val="Heading1"/>
+        <w:spacing w:before="0"/>
+      </w:pPr>
+    </w:p>
+    <w:p>
+      <w:pPr>
+        <w:pStyle w:val="Heading1"/>
+        <w:spacing w:before="0"/>
+      </w:pPr>
+    </w:p>
+    <w:p>
+      <w:pPr>
+        <w:pStyle w:val="Heading1"/>
+        <w:spacing w:before="0"/>
+      </w:pPr>
+    </w:p>
+    <w:p>
+      <w:pPr>
+        <w:pStyle w:val="Heading1"/>
+        <w:spacing w:before="0"/>
+      </w:pPr>
+    </w:p>
+    <w:p>
+      <w:pPr>
+        <w:pStyle w:val="Heading1"/>
+        <w:pageBreakBefore/>
+        <w:spacing w:before="0"/>
+      </w:pPr>
+      <w:r>
+        <w:lastRenderedPageBreak/>
         <w:t>7. Results</w:t>
       </w:r>
     </w:p>
@@ -8663,7 +8952,21 @@
               <w:rPr>
                 <w:sz w:val="18"/>
               </w:rPr>
-              <w:t>Govt saving (PKR tn; base −1.55)</w:t>
+              <w:t xml:space="preserve">Govt saving (PKR </w:t>
+            </w:r>
+            <w:proofErr w:type="spellStart"/>
+            <w:r>
+              <w:rPr>
+                <w:sz w:val="18"/>
+              </w:rPr>
+              <w:t>tn</w:t>
+            </w:r>
+            <w:proofErr w:type="spellEnd"/>
+            <w:r>
+              <w:rPr>
+                <w:sz w:val="18"/>
+              </w:rPr>
+              <w:t>; base −1.55)</w:t>
             </w:r>
           </w:p>
         </w:tc>
@@ -8740,8 +9043,7 @@
     <w:p>
       <w:pPr>
         <w:pStyle w:val="Heading2"/>
-        <w:spacing w:after="120" w:line="360" w:lineRule="auto"/>
-        <w:jc w:val="both"/>
+        <w:spacing w:after="120"/>
         <w:rPr>
           <w:rFonts w:ascii="Times New Roman" w:eastAsia="Times New Roman" w:hAnsi="Times New Roman" w:cs="Times New Roman"/>
           <w:b w:val="0"/>
@@ -8758,18 +9060,121 @@
           <w:rFonts w:ascii="Times New Roman" w:eastAsia="Times New Roman" w:hAnsi="Times New Roman" w:cs="Times New Roman"/>
           <w:b w:val="0"/>
           <w:bCs w:val="0"/>
+          <w:noProof/>
           <w:color w:val="auto"/>
           <w:sz w:val="22"/>
           <w:szCs w:val="24"/>
         </w:rPr>
+        <w:drawing>
+          <wp:inline distT="0" distB="0" distL="0" distR="0" wp14:anchorId="7CF06975" wp14:editId="10DD5D14">
+            <wp:extent cx="5943600" cy="2823210"/>
+            <wp:effectExtent l="0" t="0" r="0" b="0"/>
+            <wp:docPr id="991857998" name="Picture 2"/>
+            <wp:cNvGraphicFramePr>
+              <a:graphicFrameLocks xmlns:a="http://schemas.openxmlformats.org/drawingml/2006/main" noChangeAspect="1"/>
+            </wp:cNvGraphicFramePr>
+            <a:graphic xmlns:a="http://schemas.openxmlformats.org/drawingml/2006/main">
+              <a:graphicData uri="http://schemas.openxmlformats.org/drawingml/2006/picture">
+                <pic:pic xmlns:pic="http://schemas.openxmlformats.org/drawingml/2006/picture">
+                  <pic:nvPicPr>
+                    <pic:cNvPr id="991857998" name="Picture 991857998"/>
+                    <pic:cNvPicPr/>
+                  </pic:nvPicPr>
+                  <pic:blipFill>
+                    <a:blip r:embed="rId8" cstate="print">
+                      <a:extLst>
+                        <a:ext uri="{28A0092B-C50C-407E-A947-70E740481C1C}">
+                          <a14:useLocalDpi xmlns:a14="http://schemas.microsoft.com/office/drawing/2010/main" val="0"/>
+                        </a:ext>
+                      </a:extLst>
+                    </a:blip>
+                    <a:stretch>
+                      <a:fillRect/>
+                    </a:stretch>
+                  </pic:blipFill>
+                  <pic:spPr>
+                    <a:xfrm>
+                      <a:off x="0" y="0"/>
+                      <a:ext cx="5943600" cy="2823210"/>
+                    </a:xfrm>
+                    <a:prstGeom prst="rect">
+                      <a:avLst/>
+                    </a:prstGeom>
+                  </pic:spPr>
+                </pic:pic>
+              </a:graphicData>
+            </a:graphic>
+          </wp:inline>
+        </w:drawing>
+      </w:r>
+    </w:p>
+    <w:p>
+      <w:pPr>
+        <w:pStyle w:val="BodyText"/>
+      </w:pPr>
+      <w:r>
+        <w:rPr>
+          <w:b/>
+          <w:bCs/>
+        </w:rPr>
+        <w:t>Figure 2.</w:t>
+      </w:r>
+      <w:r>
+        <w:t xml:space="preserve"> Macroeconomic effects of the Hormuz shock (fixed real-wage closure)</w:t>
+      </w:r>
+    </w:p>
+    <w:p>
+      <w:pPr>
+        <w:pStyle w:val="Heading2"/>
+        <w:spacing w:after="120"/>
+        <w:rPr>
+          <w:rFonts w:ascii="Times New Roman" w:eastAsia="Times New Roman" w:hAnsi="Times New Roman" w:cs="Times New Roman"/>
+          <w:b w:val="0"/>
+          <w:bCs w:val="0"/>
+          <w:color w:val="auto"/>
+          <w:sz w:val="22"/>
+          <w:szCs w:val="24"/>
+        </w:rPr>
+      </w:pPr>
+      <w:r>
+        <w:rPr>
+          <w:rFonts w:ascii="Times New Roman" w:eastAsia="Times New Roman" w:hAnsi="Times New Roman" w:cs="Times New Roman"/>
+          <w:b w:val="0"/>
+          <w:bCs w:val="0"/>
+          <w:color w:val="auto"/>
+          <w:sz w:val="22"/>
+          <w:szCs w:val="24"/>
+        </w:rPr>
+        <w:lastRenderedPageBreak/>
         <w:t xml:space="preserve">The rate of exchange is adjusted. Hard to reduce energy imports; dollar import bill increases by 25-59%. With foreign savings fixed, it is necessary for a rupee depreciation of 2-5% to increase exports, while reducing the other imports. </w:t>
       </w:r>
+      <w:r>
+        <w:rPr>
+          <w:rFonts w:ascii="Times New Roman" w:eastAsia="Times New Roman" w:hAnsi="Times New Roman" w:cs="Times New Roman"/>
+          <w:b w:val="0"/>
+          <w:bCs w:val="0"/>
+          <w:color w:val="auto"/>
+          <w:sz w:val="22"/>
+          <w:szCs w:val="24"/>
+        </w:rPr>
+        <w:t>S</w:t>
+      </w:r>
+      <w:r>
+        <w:rPr>
+          <w:rFonts w:ascii="Times New Roman" w:eastAsia="Times New Roman" w:hAnsi="Times New Roman" w:cs="Times New Roman"/>
+          <w:b w:val="0"/>
+          <w:bCs w:val="0"/>
+          <w:color w:val="auto"/>
+          <w:sz w:val="22"/>
+          <w:szCs w:val="24"/>
+        </w:rPr>
+        <w:t>ee Figure 2</w:t>
+      </w:r>
     </w:p>
     <w:p>
       <w:pPr>
         <w:pStyle w:val="Heading2"/>
-        <w:spacing w:after="120" w:line="360" w:lineRule="auto"/>
-        <w:jc w:val="both"/>
+        <w:spacing w:after="120"/>
         <w:rPr>
           <w:rFonts w:ascii="Times New Roman" w:eastAsia="Times New Roman" w:hAnsi="Times New Roman" w:cs="Times New Roman"/>
           <w:b w:val="0"/>
@@ -9277,8 +9682,7 @@
     <w:p>
       <w:pPr>
         <w:pStyle w:val="Heading2"/>
-        <w:spacing w:after="120" w:line="360" w:lineRule="auto"/>
-        <w:jc w:val="both"/>
+        <w:spacing w:after="120"/>
         <w:rPr>
           <w:rFonts w:ascii="Times New Roman" w:eastAsia="Times New Roman" w:hAnsi="Times New Roman" w:cs="Times New Roman"/>
           <w:b w:val="0"/>
@@ -9295,14 +9699,73 @@
           <w:rFonts w:ascii="Times New Roman" w:eastAsia="Times New Roman" w:hAnsi="Times New Roman" w:cs="Times New Roman"/>
           <w:b w:val="0"/>
           <w:bCs w:val="0"/>
+          <w:noProof/>
           <w:color w:val="auto"/>
           <w:sz w:val="22"/>
           <w:szCs w:val="24"/>
         </w:rPr>
-        <w:lastRenderedPageBreak/>
-        <w:t xml:space="preserve">Energy is most impacted. Imported fuel cannot be replaced by local refineries or power plants, resulting in a reduction of energy output of 1.5%, and 26% of energy employment. The high volume of job loss is due to </w:t>
-      </w:r>
-      <w:r>
+        <w:drawing>
+          <wp:inline distT="0" distB="0" distL="0" distR="0" wp14:anchorId="022ECBC6" wp14:editId="02FA61E9">
+            <wp:extent cx="5943600" cy="2245360"/>
+            <wp:effectExtent l="0" t="0" r="0" b="0"/>
+            <wp:docPr id="1960520527" name="Picture 3"/>
+            <wp:cNvGraphicFramePr>
+              <a:graphicFrameLocks xmlns:a="http://schemas.openxmlformats.org/drawingml/2006/main" noChangeAspect="1"/>
+            </wp:cNvGraphicFramePr>
+            <a:graphic xmlns:a="http://schemas.openxmlformats.org/drawingml/2006/main">
+              <a:graphicData uri="http://schemas.openxmlformats.org/drawingml/2006/picture">
+                <pic:pic xmlns:pic="http://schemas.openxmlformats.org/drawingml/2006/picture">
+                  <pic:nvPicPr>
+                    <pic:cNvPr id="1960520527" name="Picture 1960520527"/>
+                    <pic:cNvPicPr/>
+                  </pic:nvPicPr>
+                  <pic:blipFill>
+                    <a:blip r:embed="rId9" cstate="print">
+                      <a:extLst>
+                        <a:ext uri="{28A0092B-C50C-407E-A947-70E740481C1C}">
+                          <a14:useLocalDpi xmlns:a14="http://schemas.microsoft.com/office/drawing/2010/main" val="0"/>
+                        </a:ext>
+                      </a:extLst>
+                    </a:blip>
+                    <a:stretch>
+                      <a:fillRect/>
+                    </a:stretch>
+                  </pic:blipFill>
+                  <pic:spPr>
+                    <a:xfrm>
+                      <a:off x="0" y="0"/>
+                      <a:ext cx="5943600" cy="2245360"/>
+                    </a:xfrm>
+                    <a:prstGeom prst="rect">
+                      <a:avLst/>
+                    </a:prstGeom>
+                  </pic:spPr>
+                </pic:pic>
+              </a:graphicData>
+            </a:graphic>
+          </wp:inline>
+        </w:drawing>
+      </w:r>
+    </w:p>
+    <w:p>
+      <w:pPr>
+        <w:pStyle w:val="BodyText"/>
+      </w:pPr>
+      <w:r>
+        <w:rPr>
+          <w:b/>
+          <w:bCs/>
+        </w:rPr>
+        <w:t>Figure 3.</w:t>
+      </w:r>
+      <w:r>
+        <w:t xml:space="preserve"> Sectoral output and employment effects, +71% shock</w:t>
+      </w:r>
+    </w:p>
+    <w:p>
+      <w:pPr>
+        <w:pStyle w:val="Heading2"/>
+        <w:spacing w:after="120"/>
         <w:rPr>
           <w:rFonts w:ascii="Times New Roman" w:eastAsia="Times New Roman" w:hAnsi="Times New Roman" w:cs="Times New Roman"/>
           <w:b w:val="0"/>
@@ -9311,8 +9774,7 @@
           <w:sz w:val="22"/>
           <w:szCs w:val="24"/>
         </w:rPr>
-        <w:t>labor</w:t>
-      </w:r>
+      </w:pPr>
       <w:r>
         <w:rPr>
           <w:rFonts w:ascii="Times New Roman" w:eastAsia="Times New Roman" w:hAnsi="Times New Roman" w:cs="Times New Roman"/>
@@ -9322,14 +9784,10 @@
           <w:sz w:val="22"/>
           <w:szCs w:val="24"/>
         </w:rPr>
-        <w:t xml:space="preserve"> being the small share of the value added in the energy sector, thus the small amount of reduction in energy output that comes as a result leads to a significant reduction in the variable factor, which in this case is labor. </w:t>
-      </w:r>
-    </w:p>
-    <w:p>
-      <w:pPr>
-        <w:pStyle w:val="Heading2"/>
-        <w:spacing w:after="120" w:line="360" w:lineRule="auto"/>
-        <w:jc w:val="both"/>
+        <w:lastRenderedPageBreak/>
+        <w:t xml:space="preserve">Energy is most impacted. Imported fuel cannot be replaced by local refineries or power plants, resulting in a reduction of energy output of 1.5%, and 26% of energy employment. The high volume of job loss is due to </w:t>
+      </w:r>
+      <w:r>
         <w:rPr>
           <w:rFonts w:ascii="Times New Roman" w:eastAsia="Times New Roman" w:hAnsi="Times New Roman" w:cs="Times New Roman"/>
           <w:b w:val="0"/>
@@ -9338,7 +9796,8 @@
           <w:sz w:val="22"/>
           <w:szCs w:val="24"/>
         </w:rPr>
-      </w:pPr>
+        <w:t>labor</w:t>
+      </w:r>
       <w:r>
         <w:rPr>
           <w:rFonts w:ascii="Times New Roman" w:eastAsia="Times New Roman" w:hAnsi="Times New Roman" w:cs="Times New Roman"/>
@@ -9348,9 +9807,8 @@
           <w:sz w:val="22"/>
           <w:szCs w:val="24"/>
         </w:rPr>
-        <w:t xml:space="preserve">Services </w:t>
-      </w:r>
-      <w:proofErr w:type="gramStart"/>
+        <w:t xml:space="preserve"> being the small share of the value added in the energy sector, thus the small amount of reduction in energy output that comes as a result leads to a significant reduction in the variable factor, which in this case is labor. </w:t>
+      </w:r>
       <w:r>
         <w:rPr>
           <w:rFonts w:ascii="Times New Roman" w:eastAsia="Times New Roman" w:hAnsi="Times New Roman" w:cs="Times New Roman"/>
@@ -9360,9 +9818,8 @@
           <w:sz w:val="22"/>
           <w:szCs w:val="24"/>
         </w:rPr>
-        <w:t>has</w:t>
-      </w:r>
-      <w:proofErr w:type="gramEnd"/>
+        <w:t>S</w:t>
+      </w:r>
       <w:r>
         <w:rPr>
           <w:rFonts w:ascii="Times New Roman" w:eastAsia="Times New Roman" w:hAnsi="Times New Roman" w:cs="Times New Roman"/>
@@ -9372,14 +9829,60 @@
           <w:sz w:val="22"/>
           <w:szCs w:val="24"/>
         </w:rPr>
+        <w:t>ee Figure 3</w:t>
+      </w:r>
+    </w:p>
+    <w:p>
+      <w:pPr>
+        <w:pStyle w:val="Heading2"/>
+        <w:spacing w:after="120"/>
+        <w:rPr>
+          <w:rFonts w:ascii="Times New Roman" w:eastAsia="Times New Roman" w:hAnsi="Times New Roman" w:cs="Times New Roman"/>
+          <w:b w:val="0"/>
+          <w:bCs w:val="0"/>
+          <w:color w:val="auto"/>
+          <w:sz w:val="22"/>
+          <w:szCs w:val="24"/>
+        </w:rPr>
+      </w:pPr>
+      <w:r>
+        <w:rPr>
+          <w:rFonts w:ascii="Times New Roman" w:eastAsia="Times New Roman" w:hAnsi="Times New Roman" w:cs="Times New Roman"/>
+          <w:b w:val="0"/>
+          <w:bCs w:val="0"/>
+          <w:color w:val="auto"/>
+          <w:sz w:val="22"/>
+          <w:szCs w:val="24"/>
+        </w:rPr>
+        <w:t xml:space="preserve">Services </w:t>
+      </w:r>
+      <w:r>
+        <w:rPr>
+          <w:rFonts w:ascii="Times New Roman" w:eastAsia="Times New Roman" w:hAnsi="Times New Roman" w:cs="Times New Roman"/>
+          <w:b w:val="0"/>
+          <w:bCs w:val="0"/>
+          <w:color w:val="auto"/>
+          <w:sz w:val="22"/>
+          <w:szCs w:val="24"/>
+        </w:rPr>
+        <w:t>have</w:t>
+      </w:r>
+      <w:r>
+        <w:rPr>
+          <w:rFonts w:ascii="Times New Roman" w:eastAsia="Times New Roman" w:hAnsi="Times New Roman" w:cs="Times New Roman"/>
+          <w:b w:val="0"/>
+          <w:bCs w:val="0"/>
+          <w:color w:val="auto"/>
+          <w:sz w:val="22"/>
+          <w:szCs w:val="24"/>
+        </w:rPr>
         <w:t xml:space="preserve"> the highest percentage decline in employment (2.5% of jobs lost) and the largest absolute employment decline of any sector, being the largest employer (outside of energy) and largest energy consumer outside of energy. Production rises marginally (+0.3%). The cost of depreciation for exports of textiles reduces their prices, but increases the costs of energy. </w:t>
       </w:r>
     </w:p>
     <w:p>
       <w:pPr>
         <w:pStyle w:val="Heading2"/>
-        <w:spacing w:after="120" w:line="360" w:lineRule="auto"/>
-        <w:jc w:val="both"/>
+        <w:spacing w:after="120"/>
         <w:rPr>
           <w:rFonts w:ascii="Times New Roman" w:eastAsia="Times New Roman" w:hAnsi="Times New Roman" w:cs="Times New Roman"/>
           <w:b w:val="0"/>
@@ -9901,8 +10404,7 @@
     <w:p>
       <w:pPr>
         <w:pStyle w:val="BodyText"/>
-        <w:spacing w:after="120" w:line="360" w:lineRule="auto"/>
-        <w:jc w:val="both"/>
+        <w:spacing w:after="120"/>
       </w:pPr>
       <w:r>
         <w:t xml:space="preserve">Households lose equally and the urban households lose slightly more. Households in cities are less dependent on wages and on Services capital, which decline the most. Remittances enhance rural households' protection to losses due to currency depreciation and agricultural incomes provide another cushion. </w:t>
@@ -9911,8 +10413,7 @@
     <w:p>
       <w:pPr>
         <w:pStyle w:val="BodyText"/>
-        <w:spacing w:after="120" w:line="360" w:lineRule="auto"/>
-        <w:jc w:val="both"/>
+        <w:spacing w:after="120"/>
       </w:pPr>
       <w:r>
         <w:t>Under UNEMP welfare losses are 20-25% higher than under FULL due to the additional shock of job reductions. The peak shock is between 2.3–2.5%, making it within the estimated range for South Asia by Kiel Institute (2026) of 1.8–3.5%.</w:t>
@@ -9933,8 +10434,7 @@
     <w:p>
       <w:pPr>
         <w:pStyle w:val="Heading1"/>
-        <w:spacing w:after="120" w:line="360" w:lineRule="auto"/>
-        <w:jc w:val="both"/>
+        <w:spacing w:after="120"/>
         <w:rPr>
           <w:rFonts w:ascii="Times New Roman" w:eastAsia="Times New Roman" w:hAnsi="Times New Roman" w:cs="Times New Roman"/>
           <w:b w:val="0"/>
@@ -9964,26 +10464,72 @@
         <w:pStyle w:val="Heading1"/>
         <w:spacing w:after="120"/>
       </w:pPr>
-      <w:r>
+    </w:p>
+    <w:p>
+      <w:pPr>
+        <w:pStyle w:val="Heading1"/>
+        <w:spacing w:after="120"/>
+      </w:pPr>
+    </w:p>
+    <w:p>
+      <w:pPr>
+        <w:pStyle w:val="Heading1"/>
+        <w:spacing w:after="120"/>
+      </w:pPr>
+    </w:p>
+    <w:p>
+      <w:pPr>
+        <w:pStyle w:val="Heading1"/>
+        <w:spacing w:after="120"/>
+      </w:pPr>
+    </w:p>
+    <w:p>
+      <w:pPr>
+        <w:pStyle w:val="Heading1"/>
+        <w:spacing w:after="120"/>
+      </w:pPr>
+    </w:p>
+    <w:p>
+      <w:pPr>
+        <w:pStyle w:val="Heading1"/>
+        <w:spacing w:after="120"/>
+      </w:pPr>
+    </w:p>
+    <w:p>
+      <w:pPr>
+        <w:pStyle w:val="Heading1"/>
+        <w:spacing w:after="120"/>
+      </w:pPr>
+    </w:p>
+    <w:p>
+      <w:pPr>
+        <w:pStyle w:val="Heading1"/>
+        <w:spacing w:after="120"/>
+      </w:pPr>
+    </w:p>
+    <w:p>
+      <w:pPr>
+        <w:pStyle w:val="Heading1"/>
+        <w:spacing w:after="120"/>
+      </w:pPr>
+    </w:p>
+    <w:p>
+      <w:pPr>
+        <w:pStyle w:val="Heading1"/>
+        <w:spacing w:after="120"/>
+      </w:pPr>
+      <w:r>
+        <w:lastRenderedPageBreak/>
         <w:t>8. Sensitivity analysis</w:t>
       </w:r>
     </w:p>
     <w:p>
       <w:pPr>
         <w:pStyle w:val="BodyText"/>
-        <w:spacing w:after="120" w:line="360" w:lineRule="auto"/>
-        <w:jc w:val="both"/>
-      </w:pPr>
-      <w:r>
-        <w:t>Seven parameter-settings are tested with the central case (B71 shock, UNEMP closure). In each of the cases the model is retuned, and before adding or removing the shock the model reproduces the benchmark exactly up to 0.000000% deviation. All slacks achieved under Walras's index &lt; 1e-</w:t>
-      </w:r>
-      <w:proofErr w:type="gramStart"/>
-      <w:r>
-        <w:t>6.All</w:t>
-      </w:r>
-      <w:proofErr w:type="gramEnd"/>
-      <w:r>
-        <w:t xml:space="preserve"> slacks achieved under Walras's index below 1e-6.</w:t>
+        <w:spacing w:after="120"/>
+      </w:pPr>
+      <w:r>
+        <w:t>Seven parameter-settings are tested with the central case (B71 shock, UNEMP closure). In each of the cases the model is retuned, and before adding or removing the shock the model reproduces the benchmark exactly up to 0.000000% deviation. All slacks achieved under Walras's index &lt; 1e-6.All slacks achieved under Walras's index below 1e-6.</w:t>
       </w:r>
     </w:p>
     <w:p>
@@ -10077,8 +10623,16 @@
               <w:rPr>
                 <w:sz w:val="18"/>
               </w:rPr>
-              <w:t>Employ-ment</w:t>
-            </w:r>
+              <w:t>Employ-</w:t>
+            </w:r>
+            <w:proofErr w:type="spellStart"/>
+            <w:r>
+              <w:rPr>
+                <w:sz w:val="18"/>
+              </w:rPr>
+              <w:t>ment</w:t>
+            </w:r>
+            <w:proofErr w:type="spellEnd"/>
           </w:p>
         </w:tc>
         <w:tc>
@@ -10111,8 +10665,16 @@
               <w:rPr>
                 <w:sz w:val="18"/>
               </w:rPr>
-              <w:t>Invest-ment</w:t>
-            </w:r>
+              <w:t>Invest-</w:t>
+            </w:r>
+            <w:proofErr w:type="spellStart"/>
+            <w:r>
+              <w:rPr>
+                <w:sz w:val="18"/>
+              </w:rPr>
+              <w:t>ment</w:t>
+            </w:r>
+            <w:proofErr w:type="spellEnd"/>
           </w:p>
         </w:tc>
         <w:tc>
@@ -11247,7 +11809,21 @@
               <w:rPr>
                 <w:sz w:val="18"/>
               </w:rPr>
-              <w:t>Energy labour share 20%</w:t>
+              <w:t xml:space="preserve">Energy </w:t>
+            </w:r>
+            <w:proofErr w:type="spellStart"/>
+            <w:r>
+              <w:rPr>
+                <w:sz w:val="18"/>
+              </w:rPr>
+              <w:t>labour</w:t>
+            </w:r>
+            <w:proofErr w:type="spellEnd"/>
+            <w:r>
+              <w:rPr>
+                <w:sz w:val="18"/>
+              </w:rPr>
+              <w:t xml:space="preserve"> share 20%</w:t>
             </w:r>
           </w:p>
         </w:tc>
@@ -11413,6 +11989,73 @@
       </w:pPr>
       <w:bookmarkStart w:id="36" w:name="what-is-robust"/>
       <w:r>
+        <w:rPr>
+          <w:noProof/>
+        </w:rPr>
+        <w:drawing>
+          <wp:inline distT="0" distB="0" distL="0" distR="0" wp14:anchorId="0CA9FE74" wp14:editId="26E3342B">
+            <wp:extent cx="5943600" cy="2509520"/>
+            <wp:effectExtent l="0" t="0" r="0" b="0"/>
+            <wp:docPr id="910946755" name="Picture 4"/>
+            <wp:cNvGraphicFramePr>
+              <a:graphicFrameLocks xmlns:a="http://schemas.openxmlformats.org/drawingml/2006/main" noChangeAspect="1"/>
+            </wp:cNvGraphicFramePr>
+            <a:graphic xmlns:a="http://schemas.openxmlformats.org/drawingml/2006/main">
+              <a:graphicData uri="http://schemas.openxmlformats.org/drawingml/2006/picture">
+                <pic:pic xmlns:pic="http://schemas.openxmlformats.org/drawingml/2006/picture">
+                  <pic:nvPicPr>
+                    <pic:cNvPr id="910946755" name="Picture 910946755"/>
+                    <pic:cNvPicPr/>
+                  </pic:nvPicPr>
+                  <pic:blipFill>
+                    <a:blip r:embed="rId10" cstate="print">
+                      <a:extLst>
+                        <a:ext uri="{28A0092B-C50C-407E-A947-70E740481C1C}">
+                          <a14:useLocalDpi xmlns:a14="http://schemas.microsoft.com/office/drawing/2010/main" val="0"/>
+                        </a:ext>
+                      </a:extLst>
+                    </a:blip>
+                    <a:stretch>
+                      <a:fillRect/>
+                    </a:stretch>
+                  </pic:blipFill>
+                  <pic:spPr>
+                    <a:xfrm>
+                      <a:off x="0" y="0"/>
+                      <a:ext cx="5943600" cy="2509520"/>
+                    </a:xfrm>
+                    <a:prstGeom prst="rect">
+                      <a:avLst/>
+                    </a:prstGeom>
+                  </pic:spPr>
+                </pic:pic>
+              </a:graphicData>
+            </a:graphic>
+          </wp:inline>
+        </w:drawing>
+      </w:r>
+    </w:p>
+    <w:p>
+      <w:pPr>
+        <w:pStyle w:val="BodyText"/>
+      </w:pPr>
+      <w:r>
+        <w:rPr>
+          <w:b/>
+          <w:bCs/>
+        </w:rPr>
+        <w:t>Figure 4.</w:t>
+      </w:r>
+      <w:r>
+        <w:t xml:space="preserve"> Sensitivity of welfare and GDP results across seven cases</w:t>
+      </w:r>
+    </w:p>
+    <w:p>
+      <w:pPr>
+        <w:pStyle w:val="Heading2"/>
+        <w:spacing w:after="120"/>
+      </w:pPr>
+      <w:r>
         <w:lastRenderedPageBreak/>
         <w:t>8.1 What is robust</w:t>
       </w:r>
@@ -11420,8 +12063,7 @@
     <w:p>
       <w:pPr>
         <w:pStyle w:val="Heading2"/>
-        <w:spacing w:after="120" w:line="360" w:lineRule="auto"/>
-        <w:jc w:val="both"/>
+        <w:spacing w:after="120"/>
         <w:rPr>
           <w:rFonts w:ascii="Times New Roman" w:eastAsia="Times New Roman" w:hAnsi="Times New Roman" w:cs="Times New Roman"/>
           <w:b w:val="0"/>
@@ -11444,12 +12086,7 @@
         </w:rPr>
         <w:t xml:space="preserve">The welfare loss of a household is the most stable outcome. The urban house hold covers between 2.4% and 2.9% in all 7 cases while rural offers 2.3% to 2.7%. In all instances, urban households suffer net losses compared with rural households. </w:t>
       </w:r>
-    </w:p>
-    <w:p>
-      <w:pPr>
-        <w:pStyle w:val="Heading2"/>
-        <w:spacing w:after="120" w:line="360" w:lineRule="auto"/>
-        <w:jc w:val="both"/>
+      <w:r>
         <w:rPr>
           <w:rFonts w:ascii="Times New Roman" w:eastAsia="Times New Roman" w:hAnsi="Times New Roman" w:cs="Times New Roman"/>
           <w:b w:val="0"/>
@@ -11458,8 +12095,13 @@
           <w:sz w:val="22"/>
           <w:szCs w:val="24"/>
         </w:rPr>
-      </w:pPr>
-      <w:r>
+        <w:t>Figure 4</w:t>
+      </w:r>
+    </w:p>
+    <w:p>
+      <w:pPr>
+        <w:pStyle w:val="Heading2"/>
+        <w:spacing w:after="120"/>
         <w:rPr>
           <w:rFonts w:ascii="Times New Roman" w:eastAsia="Times New Roman" w:hAnsi="Times New Roman" w:cs="Times New Roman"/>
           <w:b w:val="0"/>
@@ -11468,23 +12110,8 @@
           <w:sz w:val="22"/>
           <w:szCs w:val="24"/>
         </w:rPr>
-        <w:t>In all cases, the decline in investment is about 3 percent, for the reduction in real saving is independent of trade elasticities. Real GDP depreciates by 0.50-0.98% and employment by 1.8-3.5%, so the direction and order (or approximate order) of the drop in production remains unchanged.</w:t>
-      </w:r>
-    </w:p>
-    <w:p>
-      <w:pPr>
-        <w:pStyle w:val="Heading2"/>
-        <w:spacing w:after="120"/>
-      </w:pPr>
-      <w:r>
-        <w:t>8.2 What depends on assumptions</w:t>
-      </w:r>
-    </w:p>
-    <w:p>
-      <w:pPr>
-        <w:pStyle w:val="Heading2"/>
-        <w:spacing w:after="120" w:line="360" w:lineRule="auto"/>
-        <w:jc w:val="both"/>
+      </w:pPr>
+      <w:r>
         <w:rPr>
           <w:rFonts w:ascii="Times New Roman" w:eastAsia="Times New Roman" w:hAnsi="Times New Roman" w:cs="Times New Roman"/>
           <w:b w:val="0"/>
@@ -11493,10 +12120,22 @@
           <w:sz w:val="22"/>
           <w:szCs w:val="24"/>
         </w:rPr>
-      </w:pPr>
-      <w:bookmarkStart w:id="38" w:name="summary"/>
-      <w:bookmarkEnd w:id="37"/>
-      <w:r>
+        <w:t>In all cases, the decline in investment is about 3 percent, for the reduction in real saving is independent of trade elasticities. Real GDP depreciates by 0.50-0.98% and employment by 1.8-3.5%, so the direction and order (or approximate order) of the drop in production remains unchanged.</w:t>
+      </w:r>
+    </w:p>
+    <w:p>
+      <w:pPr>
+        <w:pStyle w:val="Heading2"/>
+        <w:spacing w:after="120"/>
+      </w:pPr>
+      <w:r>
+        <w:t>8.2 What depends on assumptions</w:t>
+      </w:r>
+    </w:p>
+    <w:p>
+      <w:pPr>
+        <w:pStyle w:val="Heading2"/>
+        <w:spacing w:after="120"/>
         <w:rPr>
           <w:rFonts w:ascii="Times New Roman" w:eastAsia="Times New Roman" w:hAnsi="Times New Roman" w:cs="Times New Roman"/>
           <w:b w:val="0"/>
@@ -11505,14 +12144,10 @@
           <w:sz w:val="22"/>
           <w:szCs w:val="24"/>
         </w:rPr>
-        <w:t xml:space="preserve">The exchange rate result is the most sensitive one. Loss of value between 2.4% and 7.7%. If Armington elasticities are low, the Rupee has to depreciate further for external balance to be achieved as it is difficult to scale down the imports. </w:t>
-      </w:r>
-    </w:p>
-    <w:p>
-      <w:pPr>
-        <w:pStyle w:val="Heading2"/>
-        <w:spacing w:after="120" w:line="360" w:lineRule="auto"/>
-        <w:jc w:val="both"/>
+      </w:pPr>
+      <w:bookmarkStart w:id="38" w:name="summary"/>
+      <w:bookmarkEnd w:id="37"/>
+      <w:r>
         <w:rPr>
           <w:rFonts w:ascii="Times New Roman" w:eastAsia="Times New Roman" w:hAnsi="Times New Roman" w:cs="Times New Roman"/>
           <w:b w:val="0"/>
@@ -11521,8 +12156,13 @@
           <w:sz w:val="22"/>
           <w:szCs w:val="24"/>
         </w:rPr>
-      </w:pPr>
-      <w:r>
+        <w:t xml:space="preserve">The exchange rate result is the most sensitive one. Loss of value between 2.4% and 7.7%. If Armington elasticities are low, the Rupee has to depreciate further for external balance to be achieved as it is difficult to scale down the imports. </w:t>
+      </w:r>
+    </w:p>
+    <w:p>
+      <w:pPr>
+        <w:pStyle w:val="Heading2"/>
+        <w:spacing w:after="120"/>
         <w:rPr>
           <w:rFonts w:ascii="Times New Roman" w:eastAsia="Times New Roman" w:hAnsi="Times New Roman" w:cs="Times New Roman"/>
           <w:b w:val="0"/>
@@ -11531,9 +12171,7 @@
           <w:sz w:val="22"/>
           <w:szCs w:val="24"/>
         </w:rPr>
-        <w:t xml:space="preserve">The energy Armington elasticity determines how split between price and quantity adjustment is in energy. The import value for energy is higher at 0.56, down 21.5%, while the domestic energy price increases by </w:t>
-      </w:r>
-      <w:proofErr w:type="gramStart"/>
+      </w:pPr>
       <w:r>
         <w:rPr>
           <w:rFonts w:ascii="Times New Roman" w:eastAsia="Times New Roman" w:hAnsi="Times New Roman" w:cs="Times New Roman"/>
@@ -11543,9 +12181,8 @@
           <w:sz w:val="22"/>
           <w:szCs w:val="24"/>
         </w:rPr>
-        <w:t>23.The</w:t>
-      </w:r>
-      <w:proofErr w:type="gramEnd"/>
+        <w:t xml:space="preserve">The energy Armington elasticity determines how split between price and quantity adjustment is in energy. The import value for energy is higher at 0.56, down 21.5%, while the domestic energy price increases by </w:t>
+      </w:r>
       <w:r>
         <w:rPr>
           <w:rFonts w:ascii="Times New Roman" w:eastAsia="Times New Roman" w:hAnsi="Times New Roman" w:cs="Times New Roman"/>
@@ -11555,14 +12192,9 @@
           <w:sz w:val="22"/>
           <w:szCs w:val="24"/>
         </w:rPr>
-        <w:t xml:space="preserve"> energy import value is higher at 0.56 and decreases 21.5% while the domestic energy price increases by 23%. The loss of GDP and jobs are also higher due to less energy in the economy. However, domestic production increases at a time, when Pakistan relies on import of fuel for refining and for the electricity generation, by 0.2%. We thus continue to take 0.1 to be the most likely case of damage and we take 0.56 as an upper limit on the damage. </w:t>
-      </w:r>
-    </w:p>
-    <w:p>
-      <w:pPr>
-        <w:pStyle w:val="Heading2"/>
-        <w:spacing w:after="120" w:line="360" w:lineRule="auto"/>
-        <w:jc w:val="both"/>
+        <w:t>23. The</w:t>
+      </w:r>
+      <w:r>
         <w:rPr>
           <w:rFonts w:ascii="Times New Roman" w:eastAsia="Times New Roman" w:hAnsi="Times New Roman" w:cs="Times New Roman"/>
           <w:b w:val="0"/>
@@ -11571,8 +12203,13 @@
           <w:sz w:val="22"/>
           <w:szCs w:val="24"/>
         </w:rPr>
-      </w:pPr>
-      <w:r>
+        <w:t xml:space="preserve"> energy import value is higher at 0.56 and decreases 21.5% while the domestic energy price increases by 23%. The loss of GDP and jobs are also higher due to less energy in the economy. However, domestic production increases at a time, when Pakistan relies on import of fuel for refining and for the electricity generation, by 0.2%. We thus continue to take 0.1 to be the most likely case of damage and we take 0.56 as an upper limit on the damage. </w:t>
+      </w:r>
+    </w:p>
+    <w:p>
+      <w:pPr>
+        <w:pStyle w:val="Heading2"/>
+        <w:spacing w:after="120"/>
         <w:rPr>
           <w:rFonts w:ascii="Times New Roman" w:eastAsia="Times New Roman" w:hAnsi="Times New Roman" w:cs="Times New Roman"/>
           <w:b w:val="0"/>
@@ -11581,8 +12218,7 @@
           <w:sz w:val="22"/>
           <w:szCs w:val="24"/>
         </w:rPr>
-        <w:t xml:space="preserve">The energy </w:t>
-      </w:r>
+      </w:pPr>
       <w:r>
         <w:rPr>
           <w:rFonts w:ascii="Times New Roman" w:eastAsia="Times New Roman" w:hAnsi="Times New Roman" w:cs="Times New Roman"/>
@@ -11592,7 +12228,7 @@
           <w:sz w:val="22"/>
           <w:szCs w:val="24"/>
         </w:rPr>
-        <w:t>labor</w:t>
+        <w:t xml:space="preserve">The energy </w:t>
       </w:r>
       <w:r>
         <w:rPr>
@@ -11603,7 +12239,7 @@
           <w:sz w:val="22"/>
           <w:szCs w:val="24"/>
         </w:rPr>
-        <w:t xml:space="preserve"> share is crucial to the amount of the loss. When the real wage rate is fixed, </w:t>
+        <w:t>labor</w:t>
       </w:r>
       <w:r>
         <w:rPr>
@@ -11614,7 +12250,7 @@
           <w:sz w:val="22"/>
           <w:szCs w:val="24"/>
         </w:rPr>
-        <w:t>labor-intensive</w:t>
+        <w:t xml:space="preserve"> share is crucial to the amount of the loss. When the real wage rate is fixed, </w:t>
       </w:r>
       <w:r>
         <w:rPr>
@@ -11625,23 +12261,9 @@
           <w:sz w:val="22"/>
           <w:szCs w:val="24"/>
         </w:rPr>
-        <w:t xml:space="preserve"> energy production is less affected than other sectors by a fall in GDP, falling by 3.6% as opposed to a fall of 0.88% when GDP falls by 20% rather than by 4.9% given in the bottom half of the table. This 4.9% is based on the assumption of the proportion of energy-related jobs in the LFS, and the actual employment loss could be in the vicinity of this higher estimate.</w:t>
-      </w:r>
-    </w:p>
-    <w:p>
-      <w:pPr>
-        <w:pStyle w:val="Heading2"/>
-        <w:spacing w:after="120"/>
-      </w:pPr>
-      <w:r>
-        <w:t>8.3 Summary</w:t>
-      </w:r>
-    </w:p>
-    <w:p>
-      <w:pPr>
-        <w:pStyle w:val="Heading1"/>
-        <w:spacing w:after="120" w:line="360" w:lineRule="auto"/>
-        <w:jc w:val="both"/>
+        <w:t>labor-intensive</w:t>
+      </w:r>
+      <w:r>
         <w:rPr>
           <w:rFonts w:ascii="Times New Roman" w:eastAsia="Times New Roman" w:hAnsi="Times New Roman" w:cs="Times New Roman"/>
           <w:b w:val="0"/>
@@ -11650,11 +12272,22 @@
           <w:sz w:val="22"/>
           <w:szCs w:val="24"/>
         </w:rPr>
-      </w:pPr>
-      <w:bookmarkStart w:id="39" w:name="policy-implications"/>
-      <w:bookmarkEnd w:id="35"/>
-      <w:bookmarkEnd w:id="38"/>
-      <w:r>
+        <w:t xml:space="preserve"> energy production is less affected than other sectors by a fall in GDP, falling by 3.6% as opposed to a fall of 0.88% when GDP falls by 20% rather than by 4.9% given in the bottom half of the table. This 4.9% is based on the assumption of the proportion of energy-related jobs in the LFS, and the actual employment loss could be in the vicinity of this higher estimate.</w:t>
+      </w:r>
+    </w:p>
+    <w:p>
+      <w:pPr>
+        <w:pStyle w:val="Heading2"/>
+        <w:spacing w:after="120"/>
+      </w:pPr>
+      <w:r>
+        <w:t>8.3 Summary</w:t>
+      </w:r>
+    </w:p>
+    <w:p>
+      <w:pPr>
+        <w:pStyle w:val="Heading1"/>
+        <w:spacing w:after="120"/>
         <w:rPr>
           <w:rFonts w:ascii="Times New Roman" w:eastAsia="Times New Roman" w:hAnsi="Times New Roman" w:cs="Times New Roman"/>
           <w:b w:val="0"/>
@@ -11663,8 +12296,10 @@
           <w:sz w:val="22"/>
           <w:szCs w:val="24"/>
         </w:rPr>
-        <w:t xml:space="preserve">Central estimates are conventional. All alternative cases result in similar or larger welfare losses — the higher the value of CET elasticities (and Armington elasticities for urban households) the smaller the losses, but below 0.1 percentage point. Both the greatest degree of uncertainty, the energy Armington elasticity and the energy </w:t>
-      </w:r>
+      </w:pPr>
+      <w:bookmarkStart w:id="39" w:name="policy-implications"/>
+      <w:bookmarkEnd w:id="35"/>
+      <w:bookmarkEnd w:id="38"/>
       <w:r>
         <w:rPr>
           <w:rFonts w:ascii="Times New Roman" w:eastAsia="Times New Roman" w:hAnsi="Times New Roman" w:cs="Times New Roman"/>
@@ -11674,7 +12309,7 @@
           <w:sz w:val="22"/>
           <w:szCs w:val="24"/>
         </w:rPr>
-        <w:t>labor</w:t>
+        <w:t xml:space="preserve">Central estimates are conventional. All alternative cases result in similar or larger welfare losses — the higher the value of CET elasticities (and Armington elasticities for urban households) the smaller the losses, but below 0.1 percentage point. Both the greatest degree of uncertainty, the energy Armington elasticity and the energy </w:t>
       </w:r>
       <w:r>
         <w:rPr>
@@ -11685,7 +12320,7 @@
           <w:sz w:val="22"/>
           <w:szCs w:val="24"/>
         </w:rPr>
-        <w:t xml:space="preserve"> share, </w:t>
+        <w:t>labor</w:t>
       </w:r>
       <w:r>
         <w:rPr>
@@ -11696,7 +12331,7 @@
           <w:sz w:val="22"/>
           <w:szCs w:val="24"/>
         </w:rPr>
-        <w:t>drives</w:t>
+        <w:t xml:space="preserve"> share, </w:t>
       </w:r>
       <w:r>
         <w:rPr>
@@ -11707,191 +12342,9 @@
           <w:sz w:val="22"/>
           <w:szCs w:val="24"/>
         </w:rPr>
-        <w:t xml:space="preserve"> upwards GDP losses, close to 1%.</w:t>
-      </w:r>
-    </w:p>
-    <w:p>
-      <w:pPr>
-        <w:pStyle w:val="Heading1"/>
-        <w:spacing w:after="120"/>
-      </w:pPr>
-      <w:r>
-        <w:lastRenderedPageBreak/>
-        <w:t>9. Policy implications</w:t>
-      </w:r>
-    </w:p>
-    <w:p>
-      <w:pPr>
-        <w:pStyle w:val="FirstParagraph"/>
-        <w:spacing w:after="120" w:line="360" w:lineRule="auto"/>
-        <w:jc w:val="both"/>
-      </w:pPr>
-      <w:r>
-        <w:t>The results point to five priorities. The first three follow directly from the model; the last two are directions for policy that the current model does not yet simulate.</w:t>
-      </w:r>
-    </w:p>
-    <w:p>
-      <w:pPr>
-        <w:pStyle w:val="Heading2"/>
-        <w:spacing w:after="120"/>
-      </w:pPr>
-      <w:bookmarkStart w:id="40" w:name="protect-jobs-not-only-prices"/>
-      <w:r>
-        <w:t>9.1 Protect jobs, not only prices</w:t>
-      </w:r>
-    </w:p>
-    <w:p>
-      <w:pPr>
-        <w:pStyle w:val="FirstParagraph"/>
-        <w:spacing w:after="120" w:line="360" w:lineRule="auto"/>
-        <w:jc w:val="both"/>
-      </w:pPr>
-      <w:r>
-        <w:t>Under a rigid real wage, the peak shock pushes 1.9% of the labour force out of work, and welfare losses are 20–25% larger than under flexible wages. Short-term employment support in Services and energy-linked activities, such as transport and trade, would reduce the largest part of the loss. This is where most jobs are lost in absolute terms.</w:t>
-      </w:r>
-    </w:p>
-    <w:p>
-      <w:pPr>
-        <w:pStyle w:val="Heading2"/>
-        <w:spacing w:after="120"/>
-      </w:pPr>
-      <w:bookmarkStart w:id="41" w:name="X2e64ae1630e1862f02b761b2f88d84e255d3982"/>
-      <w:bookmarkEnd w:id="40"/>
-      <w:r>
-        <w:t>9.2 Let the exchange rate adjust, but manage the pass-through</w:t>
-      </w:r>
-    </w:p>
-    <w:p>
-      <w:pPr>
-        <w:pStyle w:val="FirstParagraph"/>
-        <w:spacing w:after="120" w:line="360" w:lineRule="auto"/>
-        <w:jc w:val="both"/>
-      </w:pPr>
-      <w:r>
-        <w:t>The rupee carries most of the adjustment, depreciating by 2–5% in the central case and by up to 7.7% when imports are hard to substitute. Resisting this would drain reserves that are already thin. The State Bank should allow the adjustment while targeting second-round inflation, since depreciation also raises the rupee value of remittances and supports exporters.</w:t>
-      </w:r>
-    </w:p>
-    <w:p>
-      <w:pPr>
-        <w:pStyle w:val="Heading2"/>
-        <w:spacing w:after="120"/>
-      </w:pPr>
-      <w:bookmarkStart w:id="42" w:name="avoid-broad-fuel-subsidies"/>
-      <w:bookmarkEnd w:id="41"/>
-      <w:r>
-        <w:t>9.3 Avoid broad fuel subsidies</w:t>
-      </w:r>
-    </w:p>
-    <w:p>
-      <w:pPr>
-        <w:pStyle w:val="FirstParagraph"/>
-        <w:spacing w:after="120" w:line="360" w:lineRule="auto"/>
-        <w:jc w:val="both"/>
-      </w:pPr>
-      <w:r>
-        <w:t>In March 2026, the government spent Rs125 billion to hold petroleum prices constant (The News, 2026). A broad subsidy shifts the shock onto a budget that already runs a large deficit. Because urban and rural households lose by similar amounts, targeted cash transfers through BISP would protect poor households at lower fiscal cost than untargeted price relief.</w:t>
-      </w:r>
-    </w:p>
-    <w:p>
-      <w:pPr>
-        <w:pStyle w:val="Heading2"/>
-        <w:spacing w:after="120"/>
-      </w:pPr>
-      <w:bookmarkStart w:id="43" w:name="build-strategic-storage"/>
-      <w:bookmarkEnd w:id="42"/>
-      <w:r>
-        <w:t>9.4 Build strategic storage</w:t>
-      </w:r>
-    </w:p>
-    <w:p>
-      <w:pPr>
-        <w:pStyle w:val="FirstParagraph"/>
-        <w:spacing w:after="120" w:line="360" w:lineRule="auto"/>
-        <w:jc w:val="both"/>
-      </w:pPr>
-      <w:r>
-        <w:t>Pakistan holds less than 30 days of oil reserve cover (Business Recorder, 2026). The model shows that energy imports cannot be cut quickly without losing output. Larger strategic storage would let the country ride out a short closure without cutting supply, which turns a quantity shock into a manageable price shock.</w:t>
-      </w:r>
-    </w:p>
-    <w:p>
-      <w:pPr>
-        <w:pStyle w:val="Heading2"/>
-        <w:spacing w:after="120"/>
-      </w:pPr>
-      <w:bookmarkStart w:id="44" w:name="diversify-supply-routes-and-fuels"/>
-      <w:bookmarkEnd w:id="43"/>
-      <w:r>
-        <w:t>9.5 Diversify supply routes and fuels</w:t>
-      </w:r>
-    </w:p>
-    <w:p>
-      <w:pPr>
-        <w:pStyle w:val="FirstParagraph"/>
-        <w:spacing w:after="120" w:line="360" w:lineRule="auto"/>
-        <w:jc w:val="both"/>
-      </w:pPr>
-      <w:r>
-        <w:t>The near-Leontief link between imported fuel and domestic energy is the core reason the shock is costly. Supply from outside the Gulf, overland routes, and domestic renewables would raise the effective substitution elasticity over time. The sensitivity results show that higher substitution lowers energy job losses from 26% to 17%.</w:t>
-      </w:r>
-    </w:p>
-    <w:p>
-      <w:pPr>
-        <w:pStyle w:val="BodyText"/>
-        <w:spacing w:after="120" w:line="360" w:lineRule="auto"/>
-        <w:jc w:val="both"/>
-      </w:pPr>
-      <w:r>
-        <w:lastRenderedPageBreak/>
-        <w:t>Simulating targeted transfers, fuel subsidies and import-parity pricing directly is a natural next step for this model.</w:t>
-      </w:r>
-    </w:p>
-    <w:p>
-      <w:pPr>
-        <w:pStyle w:val="Heading1"/>
-        <w:spacing w:after="120"/>
-      </w:pPr>
-      <w:bookmarkStart w:id="45" w:name="conclusion"/>
-      <w:bookmarkEnd w:id="39"/>
-      <w:bookmarkEnd w:id="44"/>
-      <w:r>
-        <w:t>10. Conclusion</w:t>
-      </w:r>
-    </w:p>
-    <w:p>
-      <w:pPr>
-        <w:pStyle w:val="FirstParagraph"/>
-        <w:spacing w:after="120" w:line="360" w:lineRule="auto"/>
-        <w:jc w:val="both"/>
-      </w:pPr>
-      <w:r>
-        <w:t>This paper builds a new 2015-16 SAM for Pakistan from official PBS, LFS, HIES, MoF and SBP data, and uses it to calibrate a CGE model of a Strait of Hormuz disruption. A 71% rise in the price of imported energy cuts real GDP by 0.54%, raises unemployment by 1.9% of the labour force, lowers investment by 3%, and reduces household welfare by 2.3–2.5%. The rupee depreciates by about 5%, and energy employment falls by a quarter.</w:t>
-      </w:r>
-    </w:p>
-    <w:p>
-      <w:pPr>
-        <w:pStyle w:val="BodyText"/>
-        <w:spacing w:after="120" w:line="360" w:lineRule="auto"/>
-        <w:jc w:val="both"/>
-      </w:pPr>
-      <w:r>
-        <w:t>Three findings stand out. First, the labour market decides how much the shock costs: with rigid wages, losses are markedly larger. Second, the inability to replace imported fuel with domestic energy is what makes the shock expensive, so treating energy imports as easily substitutable understates the damage. Third, the welfare result is robust across all sensitivity cases, and it matches the range found by global trade models for South Asia.</w:t>
-      </w:r>
-    </w:p>
-    <w:p>
-      <w:pPr>
-        <w:pStyle w:val="Heading2"/>
-        <w:spacing w:after="120"/>
-      </w:pPr>
-      <w:bookmarkStart w:id="46" w:name="limitations-1"/>
-      <w:r>
-        <w:t>Limitations</w:t>
-      </w:r>
-    </w:p>
-    <w:p>
-      <w:pPr>
-        <w:pStyle w:val="Heading2"/>
-        <w:spacing w:after="120" w:line="360" w:lineRule="auto"/>
-        <w:jc w:val="both"/>
+        <w:t>drives</w:t>
+      </w:r>
+      <w:r>
         <w:rPr>
           <w:rFonts w:ascii="Times New Roman" w:eastAsia="Times New Roman" w:hAnsi="Times New Roman" w:cs="Times New Roman"/>
           <w:b w:val="0"/>
@@ -11900,10 +12353,294 @@
           <w:sz w:val="22"/>
           <w:szCs w:val="24"/>
         </w:rPr>
-      </w:pPr>
-      <w:bookmarkStart w:id="47" w:name="future-work"/>
-      <w:bookmarkEnd w:id="46"/>
-      <w:r>
+        <w:t xml:space="preserve"> upwards GDP losses, close to 1%.</w:t>
+      </w:r>
+    </w:p>
+    <w:p>
+      <w:pPr>
+        <w:pStyle w:val="Heading1"/>
+        <w:spacing w:after="120"/>
+      </w:pPr>
+      <w:r>
+        <w:lastRenderedPageBreak/>
+        <w:t>9. Policy implications</w:t>
+      </w:r>
+    </w:p>
+    <w:p>
+      <w:pPr>
+        <w:pStyle w:val="FirstParagraph"/>
+        <w:spacing w:after="120"/>
+      </w:pPr>
+      <w:r>
+        <w:t>The results point to five priorities. The first three follow directly from the model; the last two are directions for policy that the current model does not yet simulate.</w:t>
+      </w:r>
+    </w:p>
+    <w:p>
+      <w:pPr>
+        <w:pStyle w:val="Heading2"/>
+        <w:spacing w:after="120"/>
+      </w:pPr>
+      <w:bookmarkStart w:id="40" w:name="protect-jobs-not-only-prices"/>
+      <w:r>
+        <w:t>9.1 Protect jobs, not only prices</w:t>
+      </w:r>
+    </w:p>
+    <w:p>
+      <w:pPr>
+        <w:pStyle w:val="FirstParagraph"/>
+        <w:spacing w:after="120"/>
+      </w:pPr>
+      <w:r>
+        <w:t xml:space="preserve">Under a rigid real wage, the peak shock pushes 1.9% of the </w:t>
+      </w:r>
+      <w:proofErr w:type="spellStart"/>
+      <w:r>
+        <w:t>labour</w:t>
+      </w:r>
+      <w:proofErr w:type="spellEnd"/>
+      <w:r>
+        <w:t xml:space="preserve"> force out of work, and welfare losses are 20–25% larger than under flexible wages. Short-term employment support in Services and energy-linked activities, such as transport and trade, would reduce the largest part of the loss. This is where most jobs are lost in absolute terms.</w:t>
+      </w:r>
+    </w:p>
+    <w:p>
+      <w:pPr>
+        <w:pStyle w:val="Heading2"/>
+        <w:spacing w:after="120"/>
+      </w:pPr>
+      <w:bookmarkStart w:id="41" w:name="X2e64ae1630e1862f02b761b2f88d84e255d3982"/>
+      <w:bookmarkEnd w:id="40"/>
+      <w:r>
+        <w:t>9.2 Let the exchange rate adjust, but manage the pass-through</w:t>
+      </w:r>
+    </w:p>
+    <w:p>
+      <w:pPr>
+        <w:pStyle w:val="FirstParagraph"/>
+        <w:spacing w:after="120"/>
+      </w:pPr>
+      <w:r>
+        <w:t>The rupee carries most of the adjustment, depreciating by 2–5% in the central case and by up to 7.7% when imports are hard to substitute. Resisting this would drain reserves that are already thin. The State Bank should allow the adjustment while targeting second-round inflation, since depreciation also raises the rupee value of remittances and supports exporters.</w:t>
+      </w:r>
+    </w:p>
+    <w:p>
+      <w:pPr>
+        <w:pStyle w:val="Heading2"/>
+        <w:spacing w:after="120"/>
+      </w:pPr>
+      <w:bookmarkStart w:id="42" w:name="avoid-broad-fuel-subsidies"/>
+      <w:bookmarkEnd w:id="41"/>
+      <w:r>
+        <w:t>9.3 Avoid broad fuel subsidies</w:t>
+      </w:r>
+    </w:p>
+    <w:p>
+      <w:pPr>
+        <w:pStyle w:val="FirstParagraph"/>
+        <w:spacing w:after="120"/>
+      </w:pPr>
+      <w:r>
+        <w:t>In March 2026, the government spent Rs125 billion to hold petroleum prices constant (The News, 2026). A broad subsidy shifts the shock onto a budget that already runs a large deficit. Because urban and rural households lose by similar amounts, targeted cash transfers through BISP would protect poor households at lower fiscal cost than untargeted price relief.</w:t>
+      </w:r>
+    </w:p>
+    <w:p>
+      <w:pPr>
+        <w:pStyle w:val="Heading2"/>
+        <w:spacing w:after="120"/>
+      </w:pPr>
+      <w:bookmarkStart w:id="43" w:name="build-strategic-storage"/>
+      <w:bookmarkEnd w:id="42"/>
+      <w:r>
+        <w:t>9.4 Build strategic storage</w:t>
+      </w:r>
+    </w:p>
+    <w:p>
+      <w:pPr>
+        <w:pStyle w:val="FirstParagraph"/>
+        <w:spacing w:after="120"/>
+      </w:pPr>
+      <w:r>
+        <w:t>Pakistan holds less than 30 days of oil reserve cover (Business Recorder, 2026). The model shows that energy imports cannot be cut quickly without losing output. Larger strategic storage would let the country ride out a short closure without cutting supply, which turns a quantity shock into a manageable price shock.</w:t>
+      </w:r>
+    </w:p>
+    <w:p>
+      <w:pPr>
+        <w:pStyle w:val="Heading2"/>
+        <w:spacing w:after="120"/>
+      </w:pPr>
+      <w:bookmarkStart w:id="44" w:name="diversify-supply-routes-and-fuels"/>
+      <w:bookmarkEnd w:id="43"/>
+      <w:r>
+        <w:t>9.5 Diversify supply routes and fuels</w:t>
+      </w:r>
+    </w:p>
+    <w:p>
+      <w:pPr>
+        <w:pStyle w:val="FirstParagraph"/>
+        <w:spacing w:after="120"/>
+      </w:pPr>
+      <w:r>
+        <w:t xml:space="preserve">The near-Leontief link between imported fuel and domestic energy is the core reason the shock is costly. Supply from outside the Gulf, overland routes, and domestic renewables would raise the effective </w:t>
+      </w:r>
+      <w:r>
+        <w:lastRenderedPageBreak/>
+        <w:t>substitution elasticity over time. The sensitivity results show that higher substitution lowers energy job losses from 26% to 17%.</w:t>
+      </w:r>
+    </w:p>
+    <w:p>
+      <w:pPr>
+        <w:pStyle w:val="BodyText"/>
+        <w:spacing w:before="0" w:after="0" w:line="240" w:lineRule="auto"/>
+      </w:pPr>
+      <w:r>
+        <w:t>Simulating targeted transfers, fuel subsidies and import-parity pricing directly is a natural next step for this model.</w:t>
+      </w:r>
+    </w:p>
+    <w:p>
+      <w:pPr>
+        <w:pStyle w:val="Heading1"/>
+        <w:spacing w:before="0" w:line="240" w:lineRule="auto"/>
+      </w:pPr>
+      <w:bookmarkStart w:id="45" w:name="conclusion"/>
+      <w:bookmarkEnd w:id="39"/>
+      <w:bookmarkEnd w:id="44"/>
+    </w:p>
+    <w:p>
+      <w:pPr>
+        <w:pStyle w:val="Heading1"/>
+        <w:spacing w:before="0" w:line="240" w:lineRule="auto"/>
+      </w:pPr>
+    </w:p>
+    <w:p>
+      <w:pPr>
+        <w:pStyle w:val="Heading1"/>
+        <w:spacing w:before="0" w:line="240" w:lineRule="auto"/>
+      </w:pPr>
+    </w:p>
+    <w:p>
+      <w:pPr>
+        <w:pStyle w:val="Heading1"/>
+        <w:spacing w:after="120" w:line="240" w:lineRule="auto"/>
+      </w:pPr>
+    </w:p>
+    <w:p>
+      <w:pPr>
+        <w:pStyle w:val="Heading1"/>
+        <w:spacing w:after="120" w:line="240" w:lineRule="auto"/>
+      </w:pPr>
+    </w:p>
+    <w:p>
+      <w:pPr>
+        <w:pStyle w:val="Heading1"/>
+        <w:spacing w:after="120" w:line="240" w:lineRule="auto"/>
+      </w:pPr>
+    </w:p>
+    <w:p>
+      <w:pPr>
+        <w:pStyle w:val="Heading1"/>
+        <w:spacing w:after="120" w:line="240" w:lineRule="auto"/>
+      </w:pPr>
+    </w:p>
+    <w:p>
+      <w:pPr>
+        <w:pStyle w:val="Heading1"/>
+        <w:spacing w:after="120" w:line="240" w:lineRule="auto"/>
+      </w:pPr>
+    </w:p>
+    <w:p>
+      <w:pPr>
+        <w:pStyle w:val="Heading1"/>
+        <w:spacing w:after="120" w:line="240" w:lineRule="auto"/>
+      </w:pPr>
+    </w:p>
+    <w:p>
+      <w:pPr>
+        <w:pStyle w:val="Heading1"/>
+        <w:spacing w:after="120" w:line="240" w:lineRule="auto"/>
+      </w:pPr>
+    </w:p>
+    <w:p>
+      <w:pPr>
+        <w:pStyle w:val="Heading1"/>
+        <w:spacing w:after="120" w:line="240" w:lineRule="auto"/>
+      </w:pPr>
+    </w:p>
+    <w:p>
+      <w:pPr>
+        <w:pStyle w:val="Heading1"/>
+        <w:spacing w:after="120" w:line="240" w:lineRule="auto"/>
+      </w:pPr>
+    </w:p>
+    <w:p>
+      <w:pPr>
+        <w:pStyle w:val="Heading1"/>
+        <w:spacing w:after="120" w:line="240" w:lineRule="auto"/>
+      </w:pPr>
+    </w:p>
+    <w:p>
+      <w:pPr>
+        <w:pStyle w:val="Heading1"/>
+        <w:spacing w:before="100" w:beforeAutospacing="1" w:after="120" w:line="240" w:lineRule="auto"/>
+      </w:pPr>
+    </w:p>
+    <w:p>
+      <w:pPr>
+        <w:pStyle w:val="Heading1"/>
+        <w:pageBreakBefore/>
+        <w:spacing w:before="100" w:beforeAutospacing="1" w:after="120" w:line="240" w:lineRule="auto"/>
+      </w:pPr>
+      <w:r>
+        <w:lastRenderedPageBreak/>
+        <w:t>10. Conclusion</w:t>
+      </w:r>
+    </w:p>
+    <w:p>
+      <w:pPr>
+        <w:pStyle w:val="FirstParagraph"/>
+        <w:spacing w:after="120"/>
+      </w:pPr>
+      <w:r>
+        <w:t xml:space="preserve">This paper builds a new 2015-16 SAM for Pakistan from official PBS, LFS, HIES, MoF and SBP data, and uses it to calibrate a CGE model of a Strait of Hormuz disruption. A 71% rise in the price of imported energy cuts real GDP by 0.54%, raises unemployment by 1.9% of the </w:t>
+      </w:r>
+      <w:proofErr w:type="spellStart"/>
+      <w:r>
+        <w:t>labour</w:t>
+      </w:r>
+      <w:proofErr w:type="spellEnd"/>
+      <w:r>
+        <w:t xml:space="preserve"> force, lowers investment by 3%, and reduces household welfare by 2.3–2.5%. The rupee depreciates by about 5%, and energy employment falls by a quarter.</w:t>
+      </w:r>
+    </w:p>
+    <w:p>
+      <w:pPr>
+        <w:pStyle w:val="BodyText"/>
+        <w:spacing w:after="120"/>
+      </w:pPr>
+      <w:r>
+        <w:t xml:space="preserve">Three findings stand out. First, the </w:t>
+      </w:r>
+      <w:proofErr w:type="spellStart"/>
+      <w:r>
+        <w:t>labour</w:t>
+      </w:r>
+      <w:proofErr w:type="spellEnd"/>
+      <w:r>
+        <w:t xml:space="preserve"> market decides how much the shock costs: with rigid wages, losses are markedly larger. Second, the inability to replace imported fuel with domestic energy is what makes the shock expensive, so treating energy imports as easily substitutable understates the damage. Third, the welfare result is robust across all sensitivity cases, and it matches the range found by global trade models for South Asia.</w:t>
+      </w:r>
+    </w:p>
+    <w:p>
+      <w:pPr>
+        <w:pStyle w:val="Heading2"/>
+        <w:spacing w:after="120"/>
+      </w:pPr>
+      <w:bookmarkStart w:id="46" w:name="limitations-1"/>
+      <w:r>
+        <w:t>Limitations</w:t>
+      </w:r>
+    </w:p>
+    <w:p>
+      <w:pPr>
+        <w:pStyle w:val="Heading2"/>
+        <w:spacing w:after="120"/>
         <w:rPr>
           <w:rFonts w:ascii="Times New Roman" w:eastAsia="Times New Roman" w:hAnsi="Times New Roman" w:cs="Times New Roman"/>
           <w:b w:val="0"/>
@@ -11912,8 +12649,9 @@
           <w:sz w:val="22"/>
           <w:szCs w:val="24"/>
         </w:rPr>
-        <w:t xml:space="preserve">The model is static, featuring four sectors, one </w:t>
-      </w:r>
+      </w:pPr>
+      <w:bookmarkStart w:id="47" w:name="future-work"/>
+      <w:bookmarkEnd w:id="46"/>
       <w:r>
         <w:rPr>
           <w:rFonts w:ascii="Times New Roman" w:eastAsia="Times New Roman" w:hAnsi="Times New Roman" w:cs="Times New Roman"/>
@@ -11923,7 +12661,7 @@
           <w:sz w:val="22"/>
           <w:szCs w:val="24"/>
         </w:rPr>
-        <w:t>labor</w:t>
+        <w:t xml:space="preserve">The model is static, featuring four sectors, one </w:t>
       </w:r>
       <w:r>
         <w:rPr>
@@ -11934,6 +12672,17 @@
           <w:sz w:val="22"/>
           <w:szCs w:val="24"/>
         </w:rPr>
+        <w:t>labor</w:t>
+      </w:r>
+      <w:r>
+        <w:rPr>
+          <w:rFonts w:ascii="Times New Roman" w:eastAsia="Times New Roman" w:hAnsi="Times New Roman" w:cs="Times New Roman"/>
+          <w:b w:val="0"/>
+          <w:bCs w:val="0"/>
+          <w:color w:val="auto"/>
+          <w:sz w:val="22"/>
+          <w:szCs w:val="24"/>
+        </w:rPr>
         <w:t xml:space="preserve"> type and two household groups. It takes the shock as a price increase (rather than physical rationing) and omits remittance losses from Gulf economies (which would add significantly to the impact of the shock). Domestic energy is priced at cost (rather than import parity) so consumer price implications are probably underestimated. The base period (2015-16) is the most recent year for which Supply-Use tables were officially published, but precedes recent structural change.</w:t>
       </w:r>
     </w:p>
@@ -11949,8 +12698,7 @@
     <w:p>
       <w:pPr>
         <w:pStyle w:val="FirstParagraph"/>
-        <w:spacing w:after="120" w:line="360" w:lineRule="auto"/>
-        <w:jc w:val="both"/>
+        <w:spacing w:after="120"/>
       </w:pPr>
       <w:r>
         <w:t>Three extensions follow directly: a recursive-dynamic version to trace recovery over time; policy scenarios for targeted transfers, fuel subsidies and import-parity pricing; and a remittance shock, since roughly 55% of Pakistan’s remittances come from the Middle East (Dawn, 2026).</w:t>
@@ -11964,7 +12712,21 @@
       <w:bookmarkStart w:id="48" w:name="references"/>
       <w:bookmarkEnd w:id="45"/>
       <w:bookmarkEnd w:id="47"/>
-      <w:r>
+    </w:p>
+    <w:p>
+      <w:pPr>
+        <w:pStyle w:val="Heading1"/>
+        <w:spacing w:after="120"/>
+      </w:pPr>
+    </w:p>
+    <w:p>
+      <w:pPr>
+        <w:pStyle w:val="Heading1"/>
+        <w:pageBreakBefore/>
+        <w:spacing w:before="100" w:beforeAutospacing="1" w:after="120"/>
+      </w:pPr>
+      <w:r>
+        <w:lastRenderedPageBreak/>
         <w:t>References</w:t>
       </w:r>
     </w:p>
@@ -12002,7 +12764,6 @@
         <w:spacing w:after="120"/>
       </w:pPr>
       <w:r>
-        <w:lastRenderedPageBreak/>
         <w:t>Dallas Fed. (2026). What the closure of the Strait of Hormuz means for the global economy. Federal Reserve Bank of Dallas. https://www.dallasfed.org/research/economics/2026/0320</w:t>
       </w:r>
     </w:p>
@@ -12124,6 +12885,7 @@
         <w:spacing w:after="120"/>
       </w:pPr>
       <w:r>
+        <w:lastRenderedPageBreak/>
         <w:t xml:space="preserve">Lofgren, H., Harris, R. L., &amp; Robinson, S. (2002). </w:t>
       </w:r>
       <w:r>
@@ -12143,7 +12905,15 @@
         <w:spacing w:after="120"/>
       </w:pPr>
       <w:r>
-        <w:t xml:space="preserve">Mahmood, A., &amp; Marpaung, C. O. P. (2014). Carbon pricing and energy efficiency improvement – why to miss the interaction for developing economies? An illustrative CGE based application to the Pakistan case. </w:t>
+        <w:t xml:space="preserve">Mahmood, A., &amp; </w:t>
+      </w:r>
+      <w:proofErr w:type="spellStart"/>
+      <w:r>
+        <w:t>Marpaung</w:t>
+      </w:r>
+      <w:proofErr w:type="spellEnd"/>
+      <w:r>
+        <w:t xml:space="preserve">, C. O. P. (2014). Carbon pricing and energy efficiency improvement – why to miss the interaction for developing economies? An illustrative CGE based application to the Pakistan case. </w:t>
       </w:r>
       <w:r>
         <w:rPr>
@@ -12161,8 +12931,21 @@
         <w:pStyle w:val="BodyText"/>
         <w:spacing w:after="120"/>
       </w:pPr>
-      <w:r>
-        <w:t xml:space="preserve">Mohanasundari, T., Prahadeeswaran, M., Sen, B., &amp; Chauhan, A. (2025). Crude oil price surge and its economic implications for India: Policy simulations using a CGE framework. </w:t>
+      <w:proofErr w:type="spellStart"/>
+      <w:r>
+        <w:t>Mohanasundari</w:t>
+      </w:r>
+      <w:proofErr w:type="spellEnd"/>
+      <w:r>
+        <w:t xml:space="preserve">, T., </w:t>
+      </w:r>
+      <w:proofErr w:type="spellStart"/>
+      <w:r>
+        <w:t>Prahadeeswaran</w:t>
+      </w:r>
+      <w:proofErr w:type="spellEnd"/>
+      <w:r>
+        <w:t xml:space="preserve">, M., Sen, B., &amp; Chauhan, A. (2025). Crude oil price surge and its economic implications for India: Policy simulations using a CGE framework. </w:t>
       </w:r>
       <w:r>
         <w:rPr>
@@ -12221,31 +13004,21 @@
       <w:r>
         <w:t xml:space="preserve">Pakistan Bureau of Statistics. (2015). </w:t>
       </w:r>
+      <w:proofErr w:type="spellStart"/>
       <w:r>
         <w:rPr>
           <w:i/>
           <w:iCs/>
         </w:rPr>
-        <w:t>Labour Force Survey 2014-15: Annual Report</w:t>
-      </w:r>
-      <w:r>
-        <w:t>. Islamabad: PBS.</w:t>
-      </w:r>
-    </w:p>
-    <w:p>
-      <w:pPr>
-        <w:pStyle w:val="BodyText"/>
-        <w:spacing w:after="120"/>
-      </w:pPr>
-      <w:r>
-        <w:t xml:space="preserve">Pakistan Bureau of Statistics. (2017). </w:t>
-      </w:r>
+        <w:t>Labour</w:t>
+      </w:r>
+      <w:proofErr w:type="spellEnd"/>
       <w:r>
         <w:rPr>
           <w:i/>
           <w:iCs/>
         </w:rPr>
-        <w:t>Household Integrated Economic Survey 2015-16</w:t>
+        <w:t xml:space="preserve"> Force Survey 2014-15: Annual Report</w:t>
       </w:r>
       <w:r>
         <w:t>. Islamabad: PBS.</w:t>
@@ -12257,13 +13030,32 @@
         <w:spacing w:after="120"/>
       </w:pPr>
       <w:r>
-        <w:t xml:space="preserve">Sánchez, M. V. (2011). Welfare effects of rising oil prices in oil-importing developing countries. </w:t>
+        <w:t xml:space="preserve">Pakistan Bureau of Statistics. (2017). </w:t>
       </w:r>
       <w:r>
         <w:rPr>
           <w:i/>
           <w:iCs/>
         </w:rPr>
+        <w:t>Household Integrated Economic Survey 2015-16</w:t>
+      </w:r>
+      <w:r>
+        <w:t>. Islamabad: PBS.</w:t>
+      </w:r>
+    </w:p>
+    <w:p>
+      <w:pPr>
+        <w:pStyle w:val="BodyText"/>
+        <w:spacing w:after="120"/>
+      </w:pPr>
+      <w:r>
+        <w:t xml:space="preserve">Sánchez, M. V. (2011). Welfare effects of rising oil prices in oil-importing developing countries. </w:t>
+      </w:r>
+      <w:r>
+        <w:rPr>
+          <w:i/>
+          <w:iCs/>
+        </w:rPr>
         <w:t>The Developing Economies</w:t>
       </w:r>
       <w:r>
@@ -12276,7 +13068,6 @@
         <w:spacing w:after="120"/>
       </w:pPr>
       <w:r>
-        <w:lastRenderedPageBreak/>
         <w:t xml:space="preserve">Siddig, K., Aguiar, A., Grethe, H., Minor, P., &amp; Walmsley, T. (2014). Impacts of removing fuel import subsidies in Nigeria on poverty. </w:t>
       </w:r>
       <w:r>
@@ -12875,7 +13666,8 @@
     </w:rPrDefault>
     <w:pPrDefault>
       <w:pPr>
-        <w:spacing w:after="200"/>
+        <w:spacing w:before="200" w:after="120" w:line="360" w:lineRule="auto"/>
+        <w:jc w:val="both"/>
       </w:pPr>
     </w:pPrDefault>
   </w:docDefaults>
@@ -13162,7 +13954,7 @@
     <w:pPr>
       <w:keepNext/>
       <w:keepLines/>
-      <w:spacing w:before="200" w:after="0"/>
+      <w:spacing w:after="0"/>
       <w:outlineLvl w:val="1"/>
     </w:pPr>
     <w:rPr>
@@ -13184,7 +13976,7 @@
     <w:pPr>
       <w:keepNext/>
       <w:keepLines/>
-      <w:spacing w:before="200" w:after="0"/>
+      <w:spacing w:after="0"/>
       <w:outlineLvl w:val="2"/>
     </w:pPr>
     <w:rPr>
@@ -13205,7 +13997,7 @@
     <w:pPr>
       <w:keepNext/>
       <w:keepLines/>
-      <w:spacing w:before="200" w:after="0"/>
+      <w:spacing w:after="0"/>
       <w:outlineLvl w:val="3"/>
     </w:pPr>
     <w:rPr>
@@ -13226,7 +14018,7 @@
     <w:pPr>
       <w:keepNext/>
       <w:keepLines/>
-      <w:spacing w:before="200" w:after="0"/>
+      <w:spacing w:after="0"/>
       <w:outlineLvl w:val="4"/>
     </w:pPr>
     <w:rPr>
@@ -13246,7 +14038,7 @@
     <w:pPr>
       <w:keepNext/>
       <w:keepLines/>
-      <w:spacing w:before="200" w:after="0"/>
+      <w:spacing w:after="0"/>
       <w:outlineLvl w:val="5"/>
     </w:pPr>
     <w:rPr>
@@ -13265,7 +14057,7 @@
     <w:pPr>
       <w:keepNext/>
       <w:keepLines/>
-      <w:spacing w:before="200" w:after="0"/>
+      <w:spacing w:after="0"/>
       <w:outlineLvl w:val="6"/>
     </w:pPr>
     <w:rPr>
@@ -13284,7 +14076,7 @@
     <w:pPr>
       <w:keepNext/>
       <w:keepLines/>
-      <w:spacing w:before="200" w:after="0"/>
+      <w:spacing w:after="0"/>
       <w:outlineLvl w:val="7"/>
     </w:pPr>
     <w:rPr>
@@ -13303,7 +14095,7 @@
     <w:pPr>
       <w:keepNext/>
       <w:keepLines/>
-      <w:spacing w:before="200" w:after="0"/>
+      <w:spacing w:after="0"/>
       <w:outlineLvl w:val="8"/>
     </w:pPr>
     <w:rPr>
@@ -13315,7 +14107,6 @@
   <w:style w:type="character" w:default="1" w:styleId="DefaultParagraphFont">
     <w:name w:val="Default Paragraph Font"/>
     <w:uiPriority w:val="1"/>
-    <w:semiHidden/>
     <w:unhideWhenUsed/>
   </w:style>
   <w:style w:type="table" w:default="1" w:styleId="TableNormal">
@@ -13528,9 +14319,6 @@
     <w:name w:val="caption"/>
     <w:basedOn w:val="Normal"/>
     <w:link w:val="CaptionChar"/>
-    <w:pPr>
-      <w:spacing w:after="120"/>
-    </w:pPr>
     <w:rPr>
       <w:i/>
     </w:rPr>

</xml_diff>